<commit_message>
Rebuild the client test plans and drop the source file name from the workbook cover
</commit_message>
<xml_diff>
--- a/docs/deliverables/out/Drop-1_Transactional/BRD-09_Customer_Servicing_Facility/BIBS_TestPlan_BRD-09_Customer_Servicing_Facility_Summary_v1.0.docx
+++ b/docs/deliverables/out/Drop-1_Transactional/BRD-09_Customer_Servicing_Facility/BIBS_TestPlan_BRD-09_Customer_Servicing_Facility_Summary_v1.0.docx
@@ -836,7 +836,7 @@
               <w:rPr>
                 <w:sz w:val="18"/>
               </w:rPr>
-              <w:t>Internal draft from FRS BRD-9 v1.0 and the Customer Servicing build design</w:t>
+              <w:t>Internal draft from FRS BRD-9 v1.0</w:t>
             </w:r>
           </w:p>
         </w:tc>
@@ -1699,7 +1699,7 @@
               <w:rPr>
                 <w:sz w:val="18"/>
               </w:rPr>
-              <w:t>System test, defect fixing, UAT support</w:t>
+              <w:t>System test, issue resolution, UAT support</w:t>
             </w:r>
           </w:p>
         </w:tc>
@@ -1857,7 +1857,7 @@
           <w:t xml:space="preserve">	</w:t>
         </w:r>
         <w:r>
-          <w:t xml:space="preserve">6</w:t>
+          <w:t xml:space="preserve">5</w:t>
         </w:r>
       </w:hyperlink>
     </w:p>
@@ -1921,7 +1921,7 @@
           <w:t xml:space="preserve">	</w:t>
         </w:r>
         <w:r>
-          <w:t xml:space="preserve">7</w:t>
+          <w:t xml:space="preserve">6</w:t>
         </w:r>
       </w:hyperlink>
     </w:p>
@@ -1995,13 +1995,13 @@
       </w:pPr>
       <w:hyperlink w:anchor="_Toc000117" w:history="1">
         <w:r>
-          <w:t xml:space="preserve">6 Defect management</w:t>
+          <w:t xml:space="preserve">6 Issue management</w:t>
         </w:r>
         <w:r>
           <w:t xml:space="preserve">	</w:t>
         </w:r>
         <w:r>
-          <w:t xml:space="preserve">9</w:t>
+          <w:t xml:space="preserve">8</w:t>
         </w:r>
       </w:hyperlink>
     </w:p>
@@ -2017,7 +2017,7 @@
           <w:t xml:space="preserve">	</w:t>
         </w:r>
         <w:r>
-          <w:t xml:space="preserve">9</w:t>
+          <w:t xml:space="preserve">8</w:t>
         </w:r>
       </w:hyperlink>
     </w:p>
@@ -2049,7 +2049,7 @@
           <w:t xml:space="preserve">	</w:t>
         </w:r>
         <w:r>
-          <w:t xml:space="preserve">10</w:t>
+          <w:t xml:space="preserve">9</w:t>
         </w:r>
       </w:hyperlink>
     </w:p>
@@ -2065,7 +2065,7 @@
           <w:t xml:space="preserve">	</w:t>
         </w:r>
         <w:r>
-          <w:t xml:space="preserve">10</w:t>
+          <w:t xml:space="preserve">9</w:t>
         </w:r>
       </w:hyperlink>
     </w:p>
@@ -2097,7 +2097,7 @@
           <w:t xml:space="preserve">	</w:t>
         </w:r>
         <w:r>
-          <w:t xml:space="preserve">11</w:t>
+          <w:t xml:space="preserve">10</w:t>
         </w:r>
       </w:hyperlink>
     </w:p>
@@ -2113,7 +2113,7 @@
           <w:t xml:space="preserve">	</w:t>
         </w:r>
         <w:r>
-          <w:t xml:space="preserve">12</w:t>
+          <w:t xml:space="preserve">11</w:t>
         </w:r>
       </w:hyperlink>
     </w:p>
@@ -2129,23 +2129,23 @@
           <w:t xml:space="preserve">	</w:t>
         </w:r>
         <w:r>
-          <w:t xml:space="preserve">13</w:t>
+          <w:t xml:space="preserve">12</w:t>
         </w:r>
       </w:hyperlink>
     </w:p>
     <w:p>
       <w:pPr>
-        <w:pStyle w:val="toc2"/>
+        <w:pStyle w:val="toc1"/>
       </w:pPr>
       <w:hyperlink w:anchor="_Toc000126" w:history="1">
         <w:r>
-          <w:t xml:space="preserve">7.6 Automated tests referenced</w:t>
+          <w:t xml:space="preserve">8 Risks</w:t>
         </w:r>
         <w:r>
           <w:t xml:space="preserve">	</w:t>
         </w:r>
         <w:r>
-          <w:t xml:space="preserve">13</w:t>
+          <w:t xml:space="preserve">12</w:t>
         </w:r>
       </w:hyperlink>
     </w:p>
@@ -2155,45 +2155,13 @@
       </w:pPr>
       <w:hyperlink w:anchor="_Toc000127" w:history="1">
         <w:r>
-          <w:t xml:space="preserve">8 Risks</w:t>
-        </w:r>
-        <w:r>
-          <w:t xml:space="preserve">	</w:t>
-        </w:r>
-        <w:r>
-          <w:t xml:space="preserve">13</w:t>
-        </w:r>
-      </w:hyperlink>
-    </w:p>
-    <w:p>
-      <w:pPr>
-        <w:pStyle w:val="toc1"/>
-      </w:pPr>
-      <w:hyperlink w:anchor="_Toc000128" w:history="1">
-        <w:r>
-          <w:t xml:space="preserve">9 FRS findings</w:t>
+          <w:t xml:space="preserve">9 Sign-off</w:t>
         </w:r>
         <w:r>
           <w:t xml:space="preserve">	</w:t>
         </w:r>
         <w:r>
           <w:t xml:space="preserve">14</w:t>
-        </w:r>
-      </w:hyperlink>
-    </w:p>
-    <w:p>
-      <w:pPr>
-        <w:pStyle w:val="toc1"/>
-      </w:pPr>
-      <w:hyperlink w:anchor="_Toc000129" w:history="1">
-        <w:r>
-          <w:t xml:space="preserve">10 Sign-off</w:t>
-        </w:r>
-        <w:r>
-          <w:t xml:space="preserve">	</w:t>
-        </w:r>
-        <w:r>
-          <w:t xml:space="preserve">16</w:t>
         </w:r>
       </w:hyperlink>
       <w:r>
@@ -2253,67 +2221,7 @@
     <w:p>
       <w:r>
         <w:rPr/>
-        <w:t>The CSF is designed and not yet built. The cases are written from the FRS and the build design, so:</w:t>
-      </w:r>
-    </w:p>
-    <w:p>
-      <w:pPr>
-        <w:tabs>
-          <w:tab w:pos="312" w:val="left"/>
-        </w:tabs>
-        <w:spacing w:after="40"/>
-        <w:ind w:left="312" w:hanging="283"/>
-      </w:pPr>
-      <w:r>
-        <w:rPr>
-          <w:color w:val="004EA8"/>
-        </w:rPr>
-        <w:t>•</w:t>
-        <w:tab/>
-      </w:r>
-      <w:r>
-        <w:rPr/>
-        <w:t>expected results quote the message text of the FRS without a message code; the codes are added in version 1.1 when the module is built;</w:t>
-      </w:r>
-    </w:p>
-    <w:p>
-      <w:pPr>
-        <w:tabs>
-          <w:tab w:pos="312" w:val="left"/>
-        </w:tabs>
-        <w:spacing w:after="40"/>
-        <w:ind w:left="312" w:hanging="283"/>
-      </w:pPr>
-      <w:r>
-        <w:rPr>
-          <w:color w:val="004EA8"/>
-        </w:rPr>
-        <w:t>•</w:t>
-        <w:tab/>
-      </w:r>
-      <w:r>
-        <w:rPr/>
-        <w:t>the automation reference column is blank; the automated tests written during the build are referenced in version 1.1;</w:t>
-      </w:r>
-    </w:p>
-    <w:p>
-      <w:pPr>
-        <w:tabs>
-          <w:tab w:pos="312" w:val="left"/>
-        </w:tabs>
-        <w:spacing w:after="120"/>
-        <w:ind w:left="312" w:hanging="283"/>
-      </w:pPr>
-      <w:r>
-        <w:rPr>
-          <w:color w:val="004EA8"/>
-        </w:rPr>
-        <w:t>•</w:t>
-        <w:tab/>
-      </w:r>
-      <w:r>
-        <w:rPr/>
-        <w:t>screen paths and button labels are those of the build design and are checked against the screens before the system test starts.</w:t>
+        <w:t>The cases are written from the FRS: the expected results quote the message texts of the FRS, and the screen paths and button labels are those of the FRS. They are checked against the screens before the system test starts.</w:t>
       </w:r>
     </w:p>
     <w:p>
@@ -2834,21 +2742,7 @@
               <w:rPr>
                 <w:sz w:val="18"/>
               </w:rPr>
-              <w:t>Customer Servicing Facility BRD and e-mail thread (</w:t>
-            </w:r>
-            <w:r>
-              <w:rPr>
-                <w:rFonts w:ascii="Courier New" w:hAnsi="Courier New" w:cs="Courier New" w:eastAsia="Courier New"/>
-                <w:color w:val="2E2E2E"/>
-                <w:sz w:val="16"/>
-              </w:rPr>
-              <w:t>docs/source-documents/Customer Servicing Facility.PDF</w:t>
-            </w:r>
-            <w:r>
-              <w:rPr>
-                <w:sz w:val="18"/>
-              </w:rPr>
-              <w:t>)</w:t>
+              <w:t>Customer Servicing Facility BRD and e-mail thread</w:t>
             </w:r>
           </w:p>
         </w:tc>
@@ -2984,7 +2878,7 @@
               <w:rPr>
                 <w:sz w:val="18"/>
               </w:rPr>
-              <w:t>R4</w:t>
+              <w:t>R5</w:t>
             </w:r>
           </w:p>
         </w:tc>
@@ -3007,7 +2901,7 @@
               <w:rPr>
                 <w:sz w:val="18"/>
               </w:rPr>
-              <w:t>Customer Servicing Facility build design (</w:t>
+              <w:t>BRD discrepancy and clarification register (</w:t>
             </w:r>
             <w:r>
               <w:rPr>
@@ -3015,7 +2909,7 @@
                 <w:color w:val="2E2E2E"/>
                 <w:sz w:val="16"/>
               </w:rPr>
-              <w:t>docs/architecture/CUSTOMER_SERVICING_DESIGN.md</w:t>
+              <w:t>BIBS_Register_BRD-00_Discrepancies_and_Clarifications_v1.0.xlsx</w:t>
             </w:r>
             <w:r>
               <w:rPr>
@@ -3035,91 +2929,6 @@
               <w:right w:w="90" w:type="dxa"/>
             </w:tcMar>
             <w:shd w:val="clear" w:color="auto" w:fill="E5F5FF"/>
-          </w:tcPr>
-          <w:p>
-            <w:pPr>
-              <w:pStyle w:val="BDOITable"/>
-            </w:pPr>
-            <w:r>
-              <w:rPr>
-                <w:sz w:val="18"/>
-              </w:rPr>
-              <w:t>proposal for review</w:t>
-            </w:r>
-          </w:p>
-        </w:tc>
-      </w:tr>
-      <w:tr>
-        <w:trPr>
-          <w:cantSplit w:val="true"/>
-        </w:trPr>
-        <w:tc>
-          <w:tcPr>
-            <w:tcW w:type="dxa" w:w="855"/>
-            <w:tcMar>
-              <w:top w:w="50" w:type="dxa"/>
-              <w:bottom w:w="50" w:type="dxa"/>
-              <w:left w:w="90" w:type="dxa"/>
-              <w:right w:w="90" w:type="dxa"/>
-            </w:tcMar>
-          </w:tcPr>
-          <w:p>
-            <w:pPr>
-              <w:pStyle w:val="BDOITable"/>
-            </w:pPr>
-            <w:r>
-              <w:rPr>
-                <w:sz w:val="18"/>
-              </w:rPr>
-              <w:t>R5</w:t>
-            </w:r>
-          </w:p>
-        </w:tc>
-        <w:tc>
-          <w:tcPr>
-            <w:tcW w:type="dxa" w:w="6126"/>
-            <w:tcMar>
-              <w:top w:w="50" w:type="dxa"/>
-              <w:bottom w:w="50" w:type="dxa"/>
-              <w:left w:w="90" w:type="dxa"/>
-              <w:right w:w="90" w:type="dxa"/>
-            </w:tcMar>
-          </w:tcPr>
-          <w:p>
-            <w:pPr>
-              <w:pStyle w:val="BDOITable"/>
-            </w:pPr>
-            <w:r>
-              <w:rPr>
-                <w:sz w:val="18"/>
-              </w:rPr>
-              <w:t>BRD discrepancy and clarification register (</w:t>
-            </w:r>
-            <w:r>
-              <w:rPr>
-                <w:rFonts w:ascii="Courier New" w:hAnsi="Courier New" w:cs="Courier New" w:eastAsia="Courier New"/>
-                <w:color w:val="2E2E2E"/>
-                <w:sz w:val="16"/>
-              </w:rPr>
-              <w:t>BIBS_Register_BRD-00_Discrepancies_and_Clarifications_v1.0.xlsx</w:t>
-            </w:r>
-            <w:r>
-              <w:rPr>
-                <w:sz w:val="18"/>
-              </w:rPr>
-              <w:t>)</w:t>
-            </w:r>
-          </w:p>
-        </w:tc>
-        <w:tc>
-          <w:tcPr>
-            <w:tcW w:type="dxa" w:w="2992"/>
-            <w:tcMar>
-              <w:top w:w="50" w:type="dxa"/>
-              <w:bottom w:w="50" w:type="dxa"/>
-              <w:left w:w="90" w:type="dxa"/>
-              <w:right w:w="90" w:type="dxa"/>
-            </w:tcMar>
           </w:tcPr>
           <w:p>
             <w:pPr>
@@ -3336,7 +3145,7 @@
               <w:rPr>
                 <w:sz w:val="18"/>
               </w:rPr>
-              <w:t>Unit and integration (automated)</w:t>
+              <w:t>System test</w:t>
             </w:r>
           </w:p>
         </w:tc>
@@ -3358,7 +3167,7 @@
               <w:rPr>
                 <w:sz w:val="18"/>
               </w:rPr>
-              <w:t>Search keys, status mapping, verification rules, contact-only update, outbox, resend and upload checks, permissions, against a PostgreSQL database; frontend form checks</w:t>
+              <w:t>Every case of the workbook, screen by screen, with the SIT data sets</w:t>
             </w:r>
           </w:p>
         </w:tc>
@@ -3380,7 +3189,7 @@
               <w:rPr>
                 <w:sz w:val="18"/>
               </w:rPr>
-              <w:t>iorta TechNXT developers</w:t>
+              <w:t>iorta TechNXT QA</w:t>
             </w:r>
           </w:p>
         </w:tc>
@@ -3402,35 +3211,7 @@
               <w:rPr>
                 <w:sz w:val="18"/>
               </w:rPr>
-              <w:t>Written during the build; run on every change in CI (</w:t>
-            </w:r>
-            <w:r>
-              <w:rPr>
-                <w:rFonts w:ascii="Courier New" w:hAnsi="Courier New" w:cs="Courier New" w:eastAsia="Courier New"/>
-                <w:color w:val="2E2E2E"/>
-                <w:sz w:val="16"/>
-              </w:rPr>
-              <w:t>mvn verify</w:t>
-            </w:r>
-            <w:r>
-              <w:rPr>
-                <w:sz w:val="18"/>
-              </w:rPr>
-              <w:t xml:space="preserve">, </w:t>
-            </w:r>
-            <w:r>
-              <w:rPr>
-                <w:rFonts w:ascii="Courier New" w:hAnsi="Courier New" w:cs="Courier New" w:eastAsia="Courier New"/>
-                <w:color w:val="2E2E2E"/>
-                <w:sz w:val="16"/>
-              </w:rPr>
-              <w:t>npm run verify</w:t>
-            </w:r>
-            <w:r>
-              <w:rPr>
-                <w:sz w:val="18"/>
-              </w:rPr>
-              <w:t>)</w:t>
+              <w:t>After the CSF is deployed on SIT</w:t>
             </w:r>
           </w:p>
         </w:tc>
@@ -3458,7 +3239,7 @@
               <w:rPr>
                 <w:sz w:val="18"/>
               </w:rPr>
-              <w:t>System test</w:t>
+              <w:t>Persona end-to-end</w:t>
             </w:r>
           </w:p>
         </w:tc>
@@ -3481,7 +3262,7 @@
               <w:rPr>
                 <w:sz w:val="18"/>
               </w:rPr>
-              <w:t>Every case of the workbook, screen by screen, with the SIT data sets</w:t>
+              <w:t>The eight scenarios from start to finish by the persona that owns each step, with e-mails checked in the test mailboxes</w:t>
             </w:r>
           </w:p>
         </w:tc>
@@ -3504,7 +3285,7 @@
               <w:rPr>
                 <w:sz w:val="18"/>
               </w:rPr>
-              <w:t>iorta TechNXT QA</w:t>
+              <w:t>iorta TechNXT QA with the Contact Center testers</w:t>
             </w:r>
           </w:p>
         </w:tc>
@@ -3527,7 +3308,7 @@
               <w:rPr>
                 <w:sz w:val="18"/>
               </w:rPr>
-              <w:t>After the CSF is deployed on SIT</w:t>
+              <w:t>After the system test passes</w:t>
             </w:r>
           </w:p>
         </w:tc>
@@ -3554,7 +3335,7 @@
               <w:rPr>
                 <w:sz w:val="18"/>
               </w:rPr>
-              <w:t>Persona end-to-end</w:t>
+              <w:t>User acceptance test (UAT)</w:t>
             </w:r>
           </w:p>
         </w:tc>
@@ -3576,7 +3357,7 @@
               <w:rPr>
                 <w:sz w:val="18"/>
               </w:rPr>
-              <w:t>The eight scenarios from start to finish by the persona that owns each step, with e-mails checked in the test mailboxes</w:t>
+              <w:t>The scenarios and the High-priority cases, run by Contact Center testers on masked production-like data</w:t>
             </w:r>
           </w:p>
         </w:tc>
@@ -3598,7 +3379,7 @@
               <w:rPr>
                 <w:sz w:val="18"/>
               </w:rPr>
-              <w:t>iorta TechNXT QA with the Contact Center testers</w:t>
+              <w:t>BDO Insure Contact Center agents, supervisors and management</w:t>
             </w:r>
           </w:p>
         </w:tc>
@@ -3611,103 +3392,6 @@
               <w:left w:w="90" w:type="dxa"/>
               <w:right w:w="90" w:type="dxa"/>
             </w:tcMar>
-          </w:tcPr>
-          <w:p>
-            <w:pPr>
-              <w:pStyle w:val="BDOITable"/>
-            </w:pPr>
-            <w:r>
-              <w:rPr>
-                <w:sz w:val="18"/>
-              </w:rPr>
-              <w:t>After the system test passes</w:t>
-            </w:r>
-          </w:p>
-        </w:tc>
-      </w:tr>
-      <w:tr>
-        <w:trPr>
-          <w:cantSplit w:val="true"/>
-        </w:trPr>
-        <w:tc>
-          <w:tcPr>
-            <w:tcW w:type="dxa" w:w="1922"/>
-            <w:tcMar>
-              <w:top w:w="50" w:type="dxa"/>
-              <w:bottom w:w="50" w:type="dxa"/>
-              <w:left w:w="90" w:type="dxa"/>
-              <w:right w:w="90" w:type="dxa"/>
-            </w:tcMar>
-            <w:shd w:val="clear" w:color="auto" w:fill="E5F5FF"/>
-          </w:tcPr>
-          <w:p>
-            <w:pPr>
-              <w:pStyle w:val="BDOITable"/>
-            </w:pPr>
-            <w:r>
-              <w:rPr>
-                <w:sz w:val="18"/>
-              </w:rPr>
-              <w:t>User acceptance test (UAT)</w:t>
-            </w:r>
-          </w:p>
-        </w:tc>
-        <w:tc>
-          <w:tcPr>
-            <w:tcW w:type="dxa" w:w="3724"/>
-            <w:tcMar>
-              <w:top w:w="50" w:type="dxa"/>
-              <w:bottom w:w="50" w:type="dxa"/>
-              <w:left w:w="90" w:type="dxa"/>
-              <w:right w:w="90" w:type="dxa"/>
-            </w:tcMar>
-            <w:shd w:val="clear" w:color="auto" w:fill="E5F5FF"/>
-          </w:tcPr>
-          <w:p>
-            <w:pPr>
-              <w:pStyle w:val="BDOITable"/>
-            </w:pPr>
-            <w:r>
-              <w:rPr>
-                <w:sz w:val="18"/>
-              </w:rPr>
-              <w:t>The scenarios and the High-priority cases, run by Contact Center testers on masked production-like data</w:t>
-            </w:r>
-          </w:p>
-        </w:tc>
-        <w:tc>
-          <w:tcPr>
-            <w:tcW w:type="dxa" w:w="2163"/>
-            <w:tcMar>
-              <w:top w:w="50" w:type="dxa"/>
-              <w:bottom w:w="50" w:type="dxa"/>
-              <w:left w:w="90" w:type="dxa"/>
-              <w:right w:w="90" w:type="dxa"/>
-            </w:tcMar>
-            <w:shd w:val="clear" w:color="auto" w:fill="E5F5FF"/>
-          </w:tcPr>
-          <w:p>
-            <w:pPr>
-              <w:pStyle w:val="BDOITable"/>
-            </w:pPr>
-            <w:r>
-              <w:rPr>
-                <w:sz w:val="18"/>
-              </w:rPr>
-              <w:t>BDO Insure Contact Center agents, supervisors and management</w:t>
-            </w:r>
-          </w:p>
-        </w:tc>
-        <w:tc>
-          <w:tcPr>
-            <w:tcW w:type="dxa" w:w="2163"/>
-            <w:tcMar>
-              <w:top w:w="50" w:type="dxa"/>
-              <w:bottom w:w="50" w:type="dxa"/>
-              <w:left w:w="90" w:type="dxa"/>
-              <w:right w:w="90" w:type="dxa"/>
-            </w:tcMar>
-            <w:shd w:val="clear" w:color="auto" w:fill="E5F5FF"/>
           </w:tcPr>
           <w:p>
             <w:pPr>
@@ -3727,12 +3411,6 @@
       <w:pPr>
         <w:pStyle w:val="BDOISpacer"/>
       </w:pPr>
-    </w:p>
-    <w:p>
-      <w:r>
-        <w:rPr/>
-        <w:t>Automated tests do not replace the system test. They show that a rule holds after every change; the system test shows that the screens, messages, e-mails and reports are what the agent expects. When the automated tests exist, version 1.1 of the workbook names them in the automation reference column, and each such case is still run on the screen once per cycle.</w:t>
-      </w:r>
     </w:p>
     <w:p>
       <w:pPr>
@@ -4365,7 +4043,7 @@
     <w:p>
       <w:r>
         <w:rPr/>
-        <w:t>The workbook has a README sheet that explains every column. The sheets are Document Control, Test Conditions, Scenarios, Test Cases, Coverage, Test Data, Roles and Access and FRS Findings. Case IDs carry their condition: TC-CSF-020.2-01 is the first case of condition 2 of FR-CSF-020. Status starts as Not run; testers fill Status, Actual result, Tester, Date and Defect ID.</w:t>
+        <w:t>The workbook has a README sheet that explains every column. The sheets are Document Control, Test Conditions, Scenarios, Test Cases, Coverage, Test Data, Roles and Access. Case IDs carry their condition: TC-CSF-020.2-01 is the first case of condition 2 of FR-CSF-020. Status starts as Not run; testers fill Status, Actual result, Tester, Date and Issue ID.</w:t>
       </w:r>
     </w:p>
     <w:p>
@@ -4532,7 +4210,7 @@
               <w:rPr>
                 <w:sz w:val="18"/>
               </w:rPr>
-              <w:t>The CSF is built and deployed on SIT with its roles, parameters and lists; CI is green on the deployed commit; the automated tests of the CSF exist and pass; screen labels and messages have been compared with this plan and differences recorded; the data sets of section 4.2 are loaded; the test mailboxes receive mail.</w:t>
+              <w:t>The CSF is deployed on SIT with its roles, parameters and lists; screen labels and messages have been compared with this plan and differences recorded; the data sets of section 4.2 are loaded; the test mailboxes receive mail.</w:t>
             </w:r>
           </w:p>
         </w:tc>
@@ -4583,7 +4261,7 @@
               <w:rPr>
                 <w:sz w:val="18"/>
               </w:rPr>
-              <w:t>All High-priority system test cases are run; no open Critical defect; renewal advices of at least one source module (or loaded RENEWAL_ADVICE documents) are available.</w:t>
+              <w:t>All High-priority system test cases are run; no open Critical issue; renewal advices of at least one source module (or loaded RENEWAL_ADVICE documents) are available.</w:t>
             </w:r>
           </w:p>
         </w:tc>
@@ -4793,7 +4471,7 @@
               <w:rPr>
                 <w:sz w:val="18"/>
               </w:rPr>
-              <w:t>100 % of cases run (the legacy sync cases may be Blocked until CSQ01 is answered); 100 % of High-priority cases passed; no open Critical or High defect; open Medium and Low defects have an agreed fix date.</w:t>
+              <w:t>100 % of cases run (the legacy sync cases may be Blocked until CSQ01 is answered); 100 % of High-priority cases passed; no open Critical or High issue; open Medium and Low issues have an agreed fix date.</w:t>
             </w:r>
           </w:p>
         </w:tc>
@@ -4893,7 +4571,7 @@
               <w:rPr>
                 <w:sz w:val="18"/>
               </w:rPr>
-              <w:t>All scenarios and High-priority cases passed or accepted by the BDOI process owner; no open Critical or High defect; open defects listed with an agreed plan in the UAT sign-off; the sign-off of section 10 is signed.</w:t>
+              <w:t>All scenarios and High-priority cases passed or accepted by the BDOI process owner; no open Critical or High issue; open issues listed with an agreed plan in the UAT sign-off; the sign-off of section 9 is signed.</w:t>
             </w:r>
           </w:p>
         </w:tc>
@@ -4913,7 +4591,7 @@
       </w:r>
       <w:r>
         <w:rPr/>
-        <w:t xml:space="preserve"> Testing of a scenario stops when a Critical defect blocks it, when the environment is down for more than half a day, or when the test data is corrupted. It resumes after the fix is deployed and the blocked cases are re-run from their first step.</w:t>
+        <w:t xml:space="preserve"> Testing of a scenario stops when a Critical issue blocks it, when the environment is down for more than half a day, or when the test data is corrupted. It resumes after the fix is deployed and the blocked cases are re-run from their first step.</w:t>
       </w:r>
     </w:p>
     <w:p>
@@ -5085,7 +4763,7 @@
               <w:rPr>
                 <w:sz w:val="18"/>
               </w:rPr>
-              <w:t>CI</w:t>
+              <w:t>SIT</w:t>
             </w:r>
           </w:p>
         </w:tc>
@@ -5107,7 +4785,7 @@
               <w:rPr>
                 <w:sz w:val="18"/>
               </w:rPr>
-              <w:t>Automated unit and integration tests on every change</w:t>
+              <w:t>System test and persona end-to-end runs by iorta TechNXT QA</w:t>
             </w:r>
           </w:p>
         </w:tc>
@@ -5129,7 +4807,7 @@
               <w:rPr>
                 <w:sz w:val="18"/>
               </w:rPr>
-              <w:t>Created by each test; PostgreSQL in a container</w:t>
+              <w:t>Seed data and the data sets of section 4.2; test mailboxes</w:t>
             </w:r>
           </w:p>
         </w:tc>
@@ -5157,7 +4835,7 @@
               <w:rPr>
                 <w:sz w:val="18"/>
               </w:rPr>
-              <w:t>SIT</w:t>
+              <w:t>UAT</w:t>
             </w:r>
           </w:p>
         </w:tc>
@@ -5180,7 +4858,7 @@
               <w:rPr>
                 <w:sz w:val="18"/>
               </w:rPr>
-              <w:t>System test and persona end-to-end runs by iorta TechNXT QA</w:t>
+              <w:t>Acceptance by Contact Center testers</w:t>
             </w:r>
           </w:p>
         </w:tc>
@@ -5194,77 +4872,6 @@
               <w:right w:w="90" w:type="dxa"/>
             </w:tcMar>
             <w:shd w:val="clear" w:color="auto" w:fill="E5F5FF"/>
-          </w:tcPr>
-          <w:p>
-            <w:pPr>
-              <w:pStyle w:val="BDOITable"/>
-            </w:pPr>
-            <w:r>
-              <w:rPr>
-                <w:sz w:val="18"/>
-              </w:rPr>
-              <w:t>Seed profile migrations, the planned CSF seed V1940, and the data sets of section 4.2; test mailboxes</w:t>
-            </w:r>
-          </w:p>
-        </w:tc>
-      </w:tr>
-      <w:tr>
-        <w:trPr>
-          <w:cantSplit w:val="true"/>
-        </w:trPr>
-        <w:tc>
-          <w:tcPr>
-            <w:tcW w:type="dxa" w:w="1800"/>
-            <w:tcMar>
-              <w:top w:w="50" w:type="dxa"/>
-              <w:bottom w:w="50" w:type="dxa"/>
-              <w:left w:w="90" w:type="dxa"/>
-              <w:right w:w="90" w:type="dxa"/>
-            </w:tcMar>
-          </w:tcPr>
-          <w:p>
-            <w:pPr>
-              <w:pStyle w:val="BDOITable"/>
-            </w:pPr>
-            <w:r>
-              <w:rPr>
-                <w:sz w:val="18"/>
-              </w:rPr>
-              <w:t>UAT</w:t>
-            </w:r>
-          </w:p>
-        </w:tc>
-        <w:tc>
-          <w:tcPr>
-            <w:tcW w:type="dxa" w:w="4432"/>
-            <w:tcMar>
-              <w:top w:w="50" w:type="dxa"/>
-              <w:bottom w:w="50" w:type="dxa"/>
-              <w:left w:w="90" w:type="dxa"/>
-              <w:right w:w="90" w:type="dxa"/>
-            </w:tcMar>
-          </w:tcPr>
-          <w:p>
-            <w:pPr>
-              <w:pStyle w:val="BDOITable"/>
-            </w:pPr>
-            <w:r>
-              <w:rPr>
-                <w:sz w:val="18"/>
-              </w:rPr>
-              <w:t>Acceptance by Contact Center testers</w:t>
-            </w:r>
-          </w:p>
-        </w:tc>
-        <w:tc>
-          <w:tcPr>
-            <w:tcW w:type="dxa" w:w="3739"/>
-            <w:tcMar>
-              <w:top w:w="50" w:type="dxa"/>
-              <w:bottom w:w="50" w:type="dxa"/>
-              <w:left w:w="90" w:type="dxa"/>
-              <w:right w:w="90" w:type="dxa"/>
-            </w:tcMar>
           </w:tcPr>
           <w:p>
             <w:pPr>
@@ -5305,7 +4912,7 @@
     <w:p>
       <w:r>
         <w:rPr/>
-        <w:t>The cases refer to named data sets. The CSF has no seed yet; the build design plans V1940 with the SIT/UAT users and a status map. Until then the test lead prepares each set on SIT as its source column says.</w:t>
+        <w:t>The cases refer to named data sets. The test lead prepares each set on SIT as its source column says; the SIT/UAT users and the status map come with the seed data.</w:t>
       </w:r>
     </w:p>
     <w:p>
@@ -5496,7 +5103,7 @@
               <w:rPr>
                 <w:sz w:val="17"/>
               </w:rPr>
-              <w:t>Created by the test lead through User Access requests on SIT; planned seed V1940 of the build design</w:t>
+              <w:t>Created by the test lead through User Access requests on SIT, or the seed users</w:t>
             </w:r>
           </w:p>
         </w:tc>
@@ -5570,7 +5177,7 @@
               <w:rPr>
                 <w:sz w:val="17"/>
               </w:rPr>
-              <w:t>Prepared by the test lead on SIT from masked seed clients (V981) and accounts keyed in the BRD-1 screens</w:t>
+              <w:t>Prepared by the test lead on SIT from masked seed clients and accounts keyed in the BRD-1 screens</w:t>
             </w:r>
           </w:p>
         </w:tc>
@@ -6054,7 +5661,7 @@
               <w:rPr>
                 <w:sz w:val="17"/>
               </w:rPr>
-              <w:t>Parameters as delivered</w:t>
+              <w:t>Parameters as configured</w:t>
             </w:r>
           </w:p>
         </w:tc>
@@ -6076,7 +5683,7 @@
               <w:rPr>
                 <w:sz w:val="17"/>
               </w:rPr>
-              <w:t>Configuration delivered with the build (FRS section 9.1)</w:t>
+              <w:t>Configuration of the SIT environment (FRS section 9.1)</w:t>
             </w:r>
           </w:p>
         </w:tc>
@@ -6369,7 +5976,7 @@
               <w:rPr>
                 <w:sz w:val="18"/>
               </w:rPr>
-              <w:t>Owns this plan and the workbook; prepares environments and data; runs the daily defect triage; reports progress</w:t>
+              <w:t>Owns this plan and the workbook; prepares environments and data; runs the daily issue triage; reports progress</w:t>
             </w:r>
           </w:p>
         </w:tc>
@@ -6443,7 +6050,7 @@
               <w:rPr>
                 <w:sz w:val="18"/>
               </w:rPr>
-              <w:t>Run the system test and the persona end-to-end scenarios; raise defects with evidence</w:t>
+              <w:t>Run the system test and the persona end-to-end scenarios; raise issues with evidence</w:t>
             </w:r>
           </w:p>
         </w:tc>
@@ -6514,7 +6121,7 @@
               <w:rPr>
                 <w:sz w:val="18"/>
               </w:rPr>
-              <w:t>Write and keep the automated tests green; fix defects; support triage</w:t>
+              <w:t>Resolve issues; support triage</w:t>
             </w:r>
           </w:p>
         </w:tc>
@@ -6659,7 +6266,7 @@
               <w:rPr>
                 <w:sz w:val="18"/>
               </w:rPr>
-              <w:t>Run the UAT scenarios; confirm the expected results match the way they serve clients; raise defects</w:t>
+              <w:t>Run the UAT scenarios; confirm the expected results match the way they serve clients; raise issues</w:t>
             </w:r>
           </w:p>
         </w:tc>
@@ -6733,7 +6340,7 @@
               <w:rPr>
                 <w:sz w:val="18"/>
               </w:rPr>
-              <w:t>Decides on disputed expected results and accepted defects; signs off UAT</w:t>
+              <w:t>Decides on disputed expected results and accepted issues; signs off UAT</w:t>
             </w:r>
           </w:p>
         </w:tc>
@@ -7394,7 +7001,7 @@
       <w:bookmarkStart w:id="117" w:name="_Toc000117"/>
       <w:r>
         <w:rPr/>
-        <w:t>6 Defect management</w:t>
+        <w:t>6 Issue management</w:t>
       </w:r>
       <w:bookmarkEnd w:id="117"/>
     </w:p>
@@ -7424,7 +7031,7 @@
       </w:r>
       <w:r>
         <w:rPr/>
-        <w:t>Defect severity</w:t>
+        <w:t>Issue severity</w:t>
       </w:r>
     </w:p>
     <w:tbl>
@@ -7855,7 +7462,7 @@
       </w:r>
       <w:r>
         <w:rPr/>
-        <w:t>Testers raise a defect for each failed case, with the case ID, steps, actual result, screenshot and the client code or change number.</w:t>
+        <w:t>Testers raise an issue for each failed case, with the case ID, steps, actual result, screenshot and the client code or change number.</w:t>
       </w:r>
     </w:p>
     <w:p>
@@ -7875,7 +7482,7 @@
       </w:r>
       <w:r>
         <w:rPr/>
-        <w:t>The test lead triages new defects daily with the development lead and, during UAT, the BDOI process owner. Triage confirms the severity, links duplicates and decides whether the FRS or the build is wrong. A disputed expected result goes to the BDOI process owner; an FRS change goes to the FRS owner (see section 9).</w:t>
+        <w:t>The test lead triages new issues daily with the development lead and, during UAT, the BDOI process owner. Triage confirms the severity, links duplicates and decides whether the FRS or the system needs the correction. A disputed expected result goes to the BDOI process owner; an FRS change goes to the FRS owner, who records it in the clarifications chapter of the FRS.</w:t>
       </w:r>
     </w:p>
     <w:p>
@@ -7915,7 +7522,7 @@
       </w:r>
       <w:r>
         <w:rPr/>
-        <w:t>A fixed defect is retested with its case and the cases of the same condition; the automated tests of the FR must also pass.</w:t>
+        <w:t>A resolved issue is retested with its case and the cases of the same condition.</w:t>
       </w:r>
     </w:p>
     <w:p>
@@ -8710,7 +8317,7 @@
               <w:rPr>
                 <w:sz w:val="18"/>
               </w:rPr>
-              <w:t>Test cases with an automation reference</w:t>
+              <w:t>Roles-and-access checks (action x role)</w:t>
             </w:r>
           </w:p>
         </w:tc>
@@ -8733,7 +8340,7 @@
               <w:rPr>
                 <w:sz w:val="18"/>
               </w:rPr>
-              <w:t>0</w:t>
+              <w:t>33</w:t>
             </w:r>
           </w:p>
         </w:tc>
@@ -8760,7 +8367,7 @@
               <w:rPr>
                 <w:sz w:val="18"/>
               </w:rPr>
-              <w:t>Roles-and-access checks (action x role)</w:t>
+              <w:t>Named test data sets</w:t>
             </w:r>
           </w:p>
         </w:tc>
@@ -8773,57 +8380,6 @@
               <w:left w:w="90" w:type="dxa"/>
               <w:right w:w="90" w:type="dxa"/>
             </w:tcMar>
-          </w:tcPr>
-          <w:p>
-            <w:pPr>
-              <w:pStyle w:val="BDOITable"/>
-            </w:pPr>
-            <w:r>
-              <w:rPr>
-                <w:sz w:val="18"/>
-              </w:rPr>
-              <w:t>33</w:t>
-            </w:r>
-          </w:p>
-        </w:tc>
-      </w:tr>
-      <w:tr>
-        <w:trPr>
-          <w:cantSplit w:val="true"/>
-        </w:trPr>
-        <w:tc>
-          <w:tcPr>
-            <w:tcW w:type="dxa" w:w="6648"/>
-            <w:tcMar>
-              <w:top w:w="50" w:type="dxa"/>
-              <w:bottom w:w="50" w:type="dxa"/>
-              <w:left w:w="90" w:type="dxa"/>
-              <w:right w:w="90" w:type="dxa"/>
-            </w:tcMar>
-            <w:shd w:val="clear" w:color="auto" w:fill="E5F5FF"/>
-          </w:tcPr>
-          <w:p>
-            <w:pPr>
-              <w:pStyle w:val="BDOITable"/>
-            </w:pPr>
-            <w:r>
-              <w:rPr>
-                <w:sz w:val="18"/>
-              </w:rPr>
-              <w:t>Named test data sets</w:t>
-            </w:r>
-          </w:p>
-        </w:tc>
-        <w:tc>
-          <w:tcPr>
-            <w:tcW w:type="dxa" w:w="3324"/>
-            <w:tcMar>
-              <w:top w:w="50" w:type="dxa"/>
-              <w:bottom w:w="50" w:type="dxa"/>
-              <w:left w:w="90" w:type="dxa"/>
-              <w:right w:w="90" w:type="dxa"/>
-            </w:tcMar>
-            <w:shd w:val="clear" w:color="auto" w:fill="E5F5FF"/>
           </w:tcPr>
           <w:p>
             <w:pPr>
@@ -8847,7 +8403,7 @@
     <w:p>
       <w:r>
         <w:rPr/>
-        <w:t>Every FR has at least one positive and one negative case, and every BRD ID is covered. The builder of the workbook checks this each time the plan is built and refuses to produce a plan with a gap.</w:t>
+        <w:t>Every FR has at least one positive and one negative case, and every BRD ID is covered. The coverage is checked each time the workbook is issued, and a plan with a gap is not issued.</w:t>
       </w:r>
     </w:p>
     <w:p>
@@ -8895,14 +8451,13 @@
         <w:tblLayout w:type="fixed"/>
       </w:tblPr>
       <w:tblGrid>
-        <w:gridCol w:w="1188"/>
-        <w:gridCol w:w="3307"/>
-        <w:gridCol w:w="1653"/>
-        <w:gridCol w:w="775"/>
-        <w:gridCol w:w="775"/>
-        <w:gridCol w:w="775"/>
-        <w:gridCol w:w="671"/>
-        <w:gridCol w:w="826"/>
+        <w:gridCol w:w="1182"/>
+        <w:gridCol w:w="3804"/>
+        <w:gridCol w:w="1953"/>
+        <w:gridCol w:w="771"/>
+        <w:gridCol w:w="771"/>
+        <w:gridCol w:w="771"/>
+        <w:gridCol w:w="719"/>
       </w:tblGrid>
       <w:tr>
         <w:trPr>
@@ -8911,7 +8466,7 @@
         </w:trPr>
         <w:tc>
           <w:tcPr>
-            <w:tcW w:type="dxa" w:w="1188"/>
+            <w:tcW w:type="dxa" w:w="1182"/>
             <w:shd w:val="clear" w:color="auto" w:fill="004EA8"/>
             <w:tcMar>
               <w:top w:w="50" w:type="dxa"/>
@@ -8937,7 +8492,7 @@
         </w:tc>
         <w:tc>
           <w:tcPr>
-            <w:tcW w:type="dxa" w:w="3307"/>
+            <w:tcW w:type="dxa" w:w="3804"/>
             <w:shd w:val="clear" w:color="auto" w:fill="004EA8"/>
             <w:tcMar>
               <w:top w:w="50" w:type="dxa"/>
@@ -8963,7 +8518,7 @@
         </w:tc>
         <w:tc>
           <w:tcPr>
-            <w:tcW w:type="dxa" w:w="1653"/>
+            <w:tcW w:type="dxa" w:w="1953"/>
             <w:shd w:val="clear" w:color="auto" w:fill="004EA8"/>
             <w:tcMar>
               <w:top w:w="50" w:type="dxa"/>
@@ -8989,7 +8544,7 @@
         </w:tc>
         <w:tc>
           <w:tcPr>
-            <w:tcW w:type="dxa" w:w="775"/>
+            <w:tcW w:type="dxa" w:w="771"/>
             <w:shd w:val="clear" w:color="auto" w:fill="004EA8"/>
             <w:tcMar>
               <w:top w:w="50" w:type="dxa"/>
@@ -9015,7 +8570,7 @@
         </w:tc>
         <w:tc>
           <w:tcPr>
-            <w:tcW w:type="dxa" w:w="775"/>
+            <w:tcW w:type="dxa" w:w="771"/>
             <w:shd w:val="clear" w:color="auto" w:fill="004EA8"/>
             <w:tcMar>
               <w:top w:w="50" w:type="dxa"/>
@@ -9041,7 +8596,7 @@
         </w:tc>
         <w:tc>
           <w:tcPr>
-            <w:tcW w:type="dxa" w:w="775"/>
+            <w:tcW w:type="dxa" w:w="771"/>
             <w:shd w:val="clear" w:color="auto" w:fill="004EA8"/>
             <w:tcMar>
               <w:top w:w="50" w:type="dxa"/>
@@ -9067,7 +8622,7 @@
         </w:tc>
         <w:tc>
           <w:tcPr>
-            <w:tcW w:type="dxa" w:w="672"/>
+            <w:tcW w:type="dxa" w:w="720"/>
             <w:shd w:val="clear" w:color="auto" w:fill="004EA8"/>
             <w:tcMar>
               <w:top w:w="50" w:type="dxa"/>
@@ -9088,32 +8643,6 @@
                 <w:sz w:val="16"/>
               </w:rPr>
               <w:t>Total</w:t>
-            </w:r>
-          </w:p>
-        </w:tc>
-        <w:tc>
-          <w:tcPr>
-            <w:tcW w:type="dxa" w:w="827"/>
-            <w:shd w:val="clear" w:color="auto" w:fill="004EA8"/>
-            <w:tcMar>
-              <w:top w:w="50" w:type="dxa"/>
-              <w:bottom w:w="50" w:type="dxa"/>
-              <w:left w:w="90" w:type="dxa"/>
-              <w:right w:w="90" w:type="dxa"/>
-            </w:tcMar>
-            <w:vAlign w:val="center"/>
-          </w:tcPr>
-          <w:p>
-            <w:pPr>
-              <w:pStyle w:val="BDOITableHeader"/>
-            </w:pPr>
-            <w:r>
-              <w:rPr>
-                <w:b/>
-                <w:color w:val="FFFFFF"/>
-                <w:sz w:val="16"/>
-              </w:rPr>
-              <w:t>Auto.</w:t>
             </w:r>
           </w:p>
         </w:tc>
@@ -9124,7 +8653,7 @@
         </w:trPr>
         <w:tc>
           <w:tcPr>
-            <w:tcW w:type="dxa" w:w="1188"/>
+            <w:tcW w:type="dxa" w:w="1182"/>
             <w:tcMar>
               <w:top w:w="50" w:type="dxa"/>
               <w:bottom w:w="50" w:type="dxa"/>
@@ -9146,7 +8675,7 @@
         </w:tc>
         <w:tc>
           <w:tcPr>
-            <w:tcW w:type="dxa" w:w="3307"/>
+            <w:tcW w:type="dxa" w:w="3804"/>
             <w:tcMar>
               <w:top w:w="50" w:type="dxa"/>
               <w:bottom w:w="50" w:type="dxa"/>
@@ -9168,7 +8697,7 @@
         </w:tc>
         <w:tc>
           <w:tcPr>
-            <w:tcW w:type="dxa" w:w="1653"/>
+            <w:tcW w:type="dxa" w:w="1953"/>
             <w:tcMar>
               <w:top w:w="50" w:type="dxa"/>
               <w:bottom w:w="50" w:type="dxa"/>
@@ -9190,7 +8719,7 @@
         </w:tc>
         <w:tc>
           <w:tcPr>
-            <w:tcW w:type="dxa" w:w="775"/>
+            <w:tcW w:type="dxa" w:w="771"/>
             <w:tcMar>
               <w:top w:w="50" w:type="dxa"/>
               <w:bottom w:w="50" w:type="dxa"/>
@@ -9212,7 +8741,7 @@
         </w:tc>
         <w:tc>
           <w:tcPr>
-            <w:tcW w:type="dxa" w:w="775"/>
+            <w:tcW w:type="dxa" w:w="771"/>
             <w:tcMar>
               <w:top w:w="50" w:type="dxa"/>
               <w:bottom w:w="50" w:type="dxa"/>
@@ -9234,7 +8763,7 @@
         </w:tc>
         <w:tc>
           <w:tcPr>
-            <w:tcW w:type="dxa" w:w="775"/>
+            <w:tcW w:type="dxa" w:w="771"/>
             <w:tcMar>
               <w:top w:w="50" w:type="dxa"/>
               <w:bottom w:w="50" w:type="dxa"/>
@@ -9256,7 +8785,7 @@
         </w:tc>
         <w:tc>
           <w:tcPr>
-            <w:tcW w:type="dxa" w:w="672"/>
+            <w:tcW w:type="dxa" w:w="720"/>
             <w:tcMar>
               <w:top w:w="50" w:type="dxa"/>
               <w:bottom w:w="50" w:type="dxa"/>
@@ -9273,28 +8802,6 @@
                 <w:sz w:val="16"/>
               </w:rPr>
               <w:t>8</w:t>
-            </w:r>
-          </w:p>
-        </w:tc>
-        <w:tc>
-          <w:tcPr>
-            <w:tcW w:type="dxa" w:w="827"/>
-            <w:tcMar>
-              <w:top w:w="50" w:type="dxa"/>
-              <w:bottom w:w="50" w:type="dxa"/>
-              <w:left w:w="90" w:type="dxa"/>
-              <w:right w:w="90" w:type="dxa"/>
-            </w:tcMar>
-          </w:tcPr>
-          <w:p>
-            <w:pPr>
-              <w:pStyle w:val="BDOITable"/>
-            </w:pPr>
-            <w:r>
-              <w:rPr>
-                <w:sz w:val="16"/>
-              </w:rPr>
-              <w:t>0</w:t>
             </w:r>
           </w:p>
         </w:tc>
@@ -9305,7 +8812,7 @@
         </w:trPr>
         <w:tc>
           <w:tcPr>
-            <w:tcW w:type="dxa" w:w="1188"/>
+            <w:tcW w:type="dxa" w:w="1182"/>
             <w:tcMar>
               <w:top w:w="50" w:type="dxa"/>
               <w:bottom w:w="50" w:type="dxa"/>
@@ -9328,7 +8835,7 @@
         </w:tc>
         <w:tc>
           <w:tcPr>
-            <w:tcW w:type="dxa" w:w="3307"/>
+            <w:tcW w:type="dxa" w:w="3804"/>
             <w:tcMar>
               <w:top w:w="50" w:type="dxa"/>
               <w:bottom w:w="50" w:type="dxa"/>
@@ -9351,7 +8858,7 @@
         </w:tc>
         <w:tc>
           <w:tcPr>
-            <w:tcW w:type="dxa" w:w="1653"/>
+            <w:tcW w:type="dxa" w:w="1953"/>
             <w:tcMar>
               <w:top w:w="50" w:type="dxa"/>
               <w:bottom w:w="50" w:type="dxa"/>
@@ -9374,7 +8881,7 @@
         </w:tc>
         <w:tc>
           <w:tcPr>
-            <w:tcW w:type="dxa" w:w="775"/>
+            <w:tcW w:type="dxa" w:w="771"/>
             <w:tcMar>
               <w:top w:w="50" w:type="dxa"/>
               <w:bottom w:w="50" w:type="dxa"/>
@@ -9397,7 +8904,7 @@
         </w:tc>
         <w:tc>
           <w:tcPr>
-            <w:tcW w:type="dxa" w:w="775"/>
+            <w:tcW w:type="dxa" w:w="771"/>
             <w:tcMar>
               <w:top w:w="50" w:type="dxa"/>
               <w:bottom w:w="50" w:type="dxa"/>
@@ -9420,7 +8927,7 @@
         </w:tc>
         <w:tc>
           <w:tcPr>
-            <w:tcW w:type="dxa" w:w="775"/>
+            <w:tcW w:type="dxa" w:w="771"/>
             <w:tcMar>
               <w:top w:w="50" w:type="dxa"/>
               <w:bottom w:w="50" w:type="dxa"/>
@@ -9443,7 +8950,7 @@
         </w:tc>
         <w:tc>
           <w:tcPr>
-            <w:tcW w:type="dxa" w:w="672"/>
+            <w:tcW w:type="dxa" w:w="720"/>
             <w:tcMar>
               <w:top w:w="50" w:type="dxa"/>
               <w:bottom w:w="50" w:type="dxa"/>
@@ -9461,29 +8968,6 @@
                 <w:sz w:val="16"/>
               </w:rPr>
               <w:t>6</w:t>
-            </w:r>
-          </w:p>
-        </w:tc>
-        <w:tc>
-          <w:tcPr>
-            <w:tcW w:type="dxa" w:w="827"/>
-            <w:tcMar>
-              <w:top w:w="50" w:type="dxa"/>
-              <w:bottom w:w="50" w:type="dxa"/>
-              <w:left w:w="90" w:type="dxa"/>
-              <w:right w:w="90" w:type="dxa"/>
-            </w:tcMar>
-            <w:shd w:val="clear" w:color="auto" w:fill="E5F5FF"/>
-          </w:tcPr>
-          <w:p>
-            <w:pPr>
-              <w:pStyle w:val="BDOITable"/>
-            </w:pPr>
-            <w:r>
-              <w:rPr>
-                <w:sz w:val="16"/>
-              </w:rPr>
-              <w:t>0</w:t>
             </w:r>
           </w:p>
         </w:tc>
@@ -9494,7 +8978,7 @@
         </w:trPr>
         <w:tc>
           <w:tcPr>
-            <w:tcW w:type="dxa" w:w="1188"/>
+            <w:tcW w:type="dxa" w:w="1182"/>
             <w:tcMar>
               <w:top w:w="50" w:type="dxa"/>
               <w:bottom w:w="50" w:type="dxa"/>
@@ -9516,7 +9000,7 @@
         </w:tc>
         <w:tc>
           <w:tcPr>
-            <w:tcW w:type="dxa" w:w="3307"/>
+            <w:tcW w:type="dxa" w:w="3804"/>
             <w:tcMar>
               <w:top w:w="50" w:type="dxa"/>
               <w:bottom w:w="50" w:type="dxa"/>
@@ -9538,7 +9022,7 @@
         </w:tc>
         <w:tc>
           <w:tcPr>
-            <w:tcW w:type="dxa" w:w="1653"/>
+            <w:tcW w:type="dxa" w:w="1953"/>
             <w:tcMar>
               <w:top w:w="50" w:type="dxa"/>
               <w:bottom w:w="50" w:type="dxa"/>
@@ -9560,7 +9044,7 @@
         </w:tc>
         <w:tc>
           <w:tcPr>
-            <w:tcW w:type="dxa" w:w="775"/>
+            <w:tcW w:type="dxa" w:w="771"/>
             <w:tcMar>
               <w:top w:w="50" w:type="dxa"/>
               <w:bottom w:w="50" w:type="dxa"/>
@@ -9582,7 +9066,7 @@
         </w:tc>
         <w:tc>
           <w:tcPr>
-            <w:tcW w:type="dxa" w:w="775"/>
+            <w:tcW w:type="dxa" w:w="771"/>
             <w:tcMar>
               <w:top w:w="50" w:type="dxa"/>
               <w:bottom w:w="50" w:type="dxa"/>
@@ -9604,7 +9088,7 @@
         </w:tc>
         <w:tc>
           <w:tcPr>
-            <w:tcW w:type="dxa" w:w="775"/>
+            <w:tcW w:type="dxa" w:w="771"/>
             <w:tcMar>
               <w:top w:w="50" w:type="dxa"/>
               <w:bottom w:w="50" w:type="dxa"/>
@@ -9626,7 +9110,7 @@
         </w:tc>
         <w:tc>
           <w:tcPr>
-            <w:tcW w:type="dxa" w:w="672"/>
+            <w:tcW w:type="dxa" w:w="720"/>
             <w:tcMar>
               <w:top w:w="50" w:type="dxa"/>
               <w:bottom w:w="50" w:type="dxa"/>
@@ -9643,28 +9127,6 @@
                 <w:sz w:val="16"/>
               </w:rPr>
               <w:t>13</w:t>
-            </w:r>
-          </w:p>
-        </w:tc>
-        <w:tc>
-          <w:tcPr>
-            <w:tcW w:type="dxa" w:w="827"/>
-            <w:tcMar>
-              <w:top w:w="50" w:type="dxa"/>
-              <w:bottom w:w="50" w:type="dxa"/>
-              <w:left w:w="90" w:type="dxa"/>
-              <w:right w:w="90" w:type="dxa"/>
-            </w:tcMar>
-          </w:tcPr>
-          <w:p>
-            <w:pPr>
-              <w:pStyle w:val="BDOITable"/>
-            </w:pPr>
-            <w:r>
-              <w:rPr>
-                <w:sz w:val="16"/>
-              </w:rPr>
-              <w:t>0</w:t>
             </w:r>
           </w:p>
         </w:tc>
@@ -9675,7 +9137,7 @@
         </w:trPr>
         <w:tc>
           <w:tcPr>
-            <w:tcW w:type="dxa" w:w="1188"/>
+            <w:tcW w:type="dxa" w:w="1182"/>
             <w:tcMar>
               <w:top w:w="50" w:type="dxa"/>
               <w:bottom w:w="50" w:type="dxa"/>
@@ -9698,7 +9160,7 @@
         </w:tc>
         <w:tc>
           <w:tcPr>
-            <w:tcW w:type="dxa" w:w="3307"/>
+            <w:tcW w:type="dxa" w:w="3804"/>
             <w:tcMar>
               <w:top w:w="50" w:type="dxa"/>
               <w:bottom w:w="50" w:type="dxa"/>
@@ -9721,7 +9183,7 @@
         </w:tc>
         <w:tc>
           <w:tcPr>
-            <w:tcW w:type="dxa" w:w="1653"/>
+            <w:tcW w:type="dxa" w:w="1953"/>
             <w:tcMar>
               <w:top w:w="50" w:type="dxa"/>
               <w:bottom w:w="50" w:type="dxa"/>
@@ -9744,7 +9206,7 @@
         </w:tc>
         <w:tc>
           <w:tcPr>
-            <w:tcW w:type="dxa" w:w="775"/>
+            <w:tcW w:type="dxa" w:w="771"/>
             <w:tcMar>
               <w:top w:w="50" w:type="dxa"/>
               <w:bottom w:w="50" w:type="dxa"/>
@@ -9767,7 +9229,7 @@
         </w:tc>
         <w:tc>
           <w:tcPr>
-            <w:tcW w:type="dxa" w:w="775"/>
+            <w:tcW w:type="dxa" w:w="771"/>
             <w:tcMar>
               <w:top w:w="50" w:type="dxa"/>
               <w:bottom w:w="50" w:type="dxa"/>
@@ -9790,7 +9252,7 @@
         </w:tc>
         <w:tc>
           <w:tcPr>
-            <w:tcW w:type="dxa" w:w="775"/>
+            <w:tcW w:type="dxa" w:w="771"/>
             <w:tcMar>
               <w:top w:w="50" w:type="dxa"/>
               <w:bottom w:w="50" w:type="dxa"/>
@@ -9813,7 +9275,7 @@
         </w:tc>
         <w:tc>
           <w:tcPr>
-            <w:tcW w:type="dxa" w:w="672"/>
+            <w:tcW w:type="dxa" w:w="720"/>
             <w:tcMar>
               <w:top w:w="50" w:type="dxa"/>
               <w:bottom w:w="50" w:type="dxa"/>
@@ -9831,29 +9293,6 @@
                 <w:sz w:val="16"/>
               </w:rPr>
               <w:t>6</w:t>
-            </w:r>
-          </w:p>
-        </w:tc>
-        <w:tc>
-          <w:tcPr>
-            <w:tcW w:type="dxa" w:w="827"/>
-            <w:tcMar>
-              <w:top w:w="50" w:type="dxa"/>
-              <w:bottom w:w="50" w:type="dxa"/>
-              <w:left w:w="90" w:type="dxa"/>
-              <w:right w:w="90" w:type="dxa"/>
-            </w:tcMar>
-            <w:shd w:val="clear" w:color="auto" w:fill="E5F5FF"/>
-          </w:tcPr>
-          <w:p>
-            <w:pPr>
-              <w:pStyle w:val="BDOITable"/>
-            </w:pPr>
-            <w:r>
-              <w:rPr>
-                <w:sz w:val="16"/>
-              </w:rPr>
-              <w:t>0</w:t>
             </w:r>
           </w:p>
         </w:tc>
@@ -9864,7 +9303,7 @@
         </w:trPr>
         <w:tc>
           <w:tcPr>
-            <w:tcW w:type="dxa" w:w="1188"/>
+            <w:tcW w:type="dxa" w:w="1182"/>
             <w:tcMar>
               <w:top w:w="50" w:type="dxa"/>
               <w:bottom w:w="50" w:type="dxa"/>
@@ -9886,7 +9325,7 @@
         </w:tc>
         <w:tc>
           <w:tcPr>
-            <w:tcW w:type="dxa" w:w="3307"/>
+            <w:tcW w:type="dxa" w:w="3804"/>
             <w:tcMar>
               <w:top w:w="50" w:type="dxa"/>
               <w:bottom w:w="50" w:type="dxa"/>
@@ -9908,7 +9347,7 @@
         </w:tc>
         <w:tc>
           <w:tcPr>
-            <w:tcW w:type="dxa" w:w="1653"/>
+            <w:tcW w:type="dxa" w:w="1953"/>
             <w:tcMar>
               <w:top w:w="50" w:type="dxa"/>
               <w:bottom w:w="50" w:type="dxa"/>
@@ -9930,7 +9369,7 @@
         </w:tc>
         <w:tc>
           <w:tcPr>
-            <w:tcW w:type="dxa" w:w="775"/>
+            <w:tcW w:type="dxa" w:w="771"/>
             <w:tcMar>
               <w:top w:w="50" w:type="dxa"/>
               <w:bottom w:w="50" w:type="dxa"/>
@@ -9952,7 +9391,7 @@
         </w:tc>
         <w:tc>
           <w:tcPr>
-            <w:tcW w:type="dxa" w:w="775"/>
+            <w:tcW w:type="dxa" w:w="771"/>
             <w:tcMar>
               <w:top w:w="50" w:type="dxa"/>
               <w:bottom w:w="50" w:type="dxa"/>
@@ -9974,7 +9413,7 @@
         </w:tc>
         <w:tc>
           <w:tcPr>
-            <w:tcW w:type="dxa" w:w="775"/>
+            <w:tcW w:type="dxa" w:w="771"/>
             <w:tcMar>
               <w:top w:w="50" w:type="dxa"/>
               <w:bottom w:w="50" w:type="dxa"/>
@@ -9996,7 +9435,7 @@
         </w:tc>
         <w:tc>
           <w:tcPr>
-            <w:tcW w:type="dxa" w:w="672"/>
+            <w:tcW w:type="dxa" w:w="720"/>
             <w:tcMar>
               <w:top w:w="50" w:type="dxa"/>
               <w:bottom w:w="50" w:type="dxa"/>
@@ -10013,28 +9452,6 @@
                 <w:sz w:val="16"/>
               </w:rPr>
               <w:t>5</w:t>
-            </w:r>
-          </w:p>
-        </w:tc>
-        <w:tc>
-          <w:tcPr>
-            <w:tcW w:type="dxa" w:w="827"/>
-            <w:tcMar>
-              <w:top w:w="50" w:type="dxa"/>
-              <w:bottom w:w="50" w:type="dxa"/>
-              <w:left w:w="90" w:type="dxa"/>
-              <w:right w:w="90" w:type="dxa"/>
-            </w:tcMar>
-          </w:tcPr>
-          <w:p>
-            <w:pPr>
-              <w:pStyle w:val="BDOITable"/>
-            </w:pPr>
-            <w:r>
-              <w:rPr>
-                <w:sz w:val="16"/>
-              </w:rPr>
-              <w:t>0</w:t>
             </w:r>
           </w:p>
         </w:tc>
@@ -10045,7 +9462,7 @@
         </w:trPr>
         <w:tc>
           <w:tcPr>
-            <w:tcW w:type="dxa" w:w="1188"/>
+            <w:tcW w:type="dxa" w:w="1182"/>
             <w:tcMar>
               <w:top w:w="50" w:type="dxa"/>
               <w:bottom w:w="50" w:type="dxa"/>
@@ -10068,7 +9485,7 @@
         </w:tc>
         <w:tc>
           <w:tcPr>
-            <w:tcW w:type="dxa" w:w="3307"/>
+            <w:tcW w:type="dxa" w:w="3804"/>
             <w:tcMar>
               <w:top w:w="50" w:type="dxa"/>
               <w:bottom w:w="50" w:type="dxa"/>
@@ -10091,7 +9508,7 @@
         </w:tc>
         <w:tc>
           <w:tcPr>
-            <w:tcW w:type="dxa" w:w="1653"/>
+            <w:tcW w:type="dxa" w:w="1953"/>
             <w:tcMar>
               <w:top w:w="50" w:type="dxa"/>
               <w:bottom w:w="50" w:type="dxa"/>
@@ -10114,7 +9531,7 @@
         </w:tc>
         <w:tc>
           <w:tcPr>
-            <w:tcW w:type="dxa" w:w="775"/>
+            <w:tcW w:type="dxa" w:w="771"/>
             <w:tcMar>
               <w:top w:w="50" w:type="dxa"/>
               <w:bottom w:w="50" w:type="dxa"/>
@@ -10137,7 +9554,7 @@
         </w:tc>
         <w:tc>
           <w:tcPr>
-            <w:tcW w:type="dxa" w:w="775"/>
+            <w:tcW w:type="dxa" w:w="771"/>
             <w:tcMar>
               <w:top w:w="50" w:type="dxa"/>
               <w:bottom w:w="50" w:type="dxa"/>
@@ -10160,7 +9577,7 @@
         </w:tc>
         <w:tc>
           <w:tcPr>
-            <w:tcW w:type="dxa" w:w="775"/>
+            <w:tcW w:type="dxa" w:w="771"/>
             <w:tcMar>
               <w:top w:w="50" w:type="dxa"/>
               <w:bottom w:w="50" w:type="dxa"/>
@@ -10183,7 +9600,7 @@
         </w:tc>
         <w:tc>
           <w:tcPr>
-            <w:tcW w:type="dxa" w:w="672"/>
+            <w:tcW w:type="dxa" w:w="720"/>
             <w:tcMar>
               <w:top w:w="50" w:type="dxa"/>
               <w:bottom w:w="50" w:type="dxa"/>
@@ -10201,29 +9618,6 @@
                 <w:sz w:val="16"/>
               </w:rPr>
               <w:t>6</w:t>
-            </w:r>
-          </w:p>
-        </w:tc>
-        <w:tc>
-          <w:tcPr>
-            <w:tcW w:type="dxa" w:w="827"/>
-            <w:tcMar>
-              <w:top w:w="50" w:type="dxa"/>
-              <w:bottom w:w="50" w:type="dxa"/>
-              <w:left w:w="90" w:type="dxa"/>
-              <w:right w:w="90" w:type="dxa"/>
-            </w:tcMar>
-            <w:shd w:val="clear" w:color="auto" w:fill="E5F5FF"/>
-          </w:tcPr>
-          <w:p>
-            <w:pPr>
-              <w:pStyle w:val="BDOITable"/>
-            </w:pPr>
-            <w:r>
-              <w:rPr>
-                <w:sz w:val="16"/>
-              </w:rPr>
-              <w:t>0</w:t>
             </w:r>
           </w:p>
         </w:tc>
@@ -10234,7 +9628,7 @@
         </w:trPr>
         <w:tc>
           <w:tcPr>
-            <w:tcW w:type="dxa" w:w="1188"/>
+            <w:tcW w:type="dxa" w:w="1182"/>
             <w:tcMar>
               <w:top w:w="50" w:type="dxa"/>
               <w:bottom w:w="50" w:type="dxa"/>
@@ -10256,7 +9650,7 @@
         </w:tc>
         <w:tc>
           <w:tcPr>
-            <w:tcW w:type="dxa" w:w="3307"/>
+            <w:tcW w:type="dxa" w:w="3804"/>
             <w:tcMar>
               <w:top w:w="50" w:type="dxa"/>
               <w:bottom w:w="50" w:type="dxa"/>
@@ -10278,7 +9672,7 @@
         </w:tc>
         <w:tc>
           <w:tcPr>
-            <w:tcW w:type="dxa" w:w="1653"/>
+            <w:tcW w:type="dxa" w:w="1953"/>
             <w:tcMar>
               <w:top w:w="50" w:type="dxa"/>
               <w:bottom w:w="50" w:type="dxa"/>
@@ -10300,7 +9694,7 @@
         </w:tc>
         <w:tc>
           <w:tcPr>
-            <w:tcW w:type="dxa" w:w="775"/>
+            <w:tcW w:type="dxa" w:w="771"/>
             <w:tcMar>
               <w:top w:w="50" w:type="dxa"/>
               <w:bottom w:w="50" w:type="dxa"/>
@@ -10322,7 +9716,7 @@
         </w:tc>
         <w:tc>
           <w:tcPr>
-            <w:tcW w:type="dxa" w:w="775"/>
+            <w:tcW w:type="dxa" w:w="771"/>
             <w:tcMar>
               <w:top w:w="50" w:type="dxa"/>
               <w:bottom w:w="50" w:type="dxa"/>
@@ -10344,7 +9738,7 @@
         </w:tc>
         <w:tc>
           <w:tcPr>
-            <w:tcW w:type="dxa" w:w="775"/>
+            <w:tcW w:type="dxa" w:w="771"/>
             <w:tcMar>
               <w:top w:w="50" w:type="dxa"/>
               <w:bottom w:w="50" w:type="dxa"/>
@@ -10366,7 +9760,7 @@
         </w:tc>
         <w:tc>
           <w:tcPr>
-            <w:tcW w:type="dxa" w:w="672"/>
+            <w:tcW w:type="dxa" w:w="720"/>
             <w:tcMar>
               <w:top w:w="50" w:type="dxa"/>
               <w:bottom w:w="50" w:type="dxa"/>
@@ -10383,28 +9777,6 @@
                 <w:sz w:val="16"/>
               </w:rPr>
               <w:t>9</w:t>
-            </w:r>
-          </w:p>
-        </w:tc>
-        <w:tc>
-          <w:tcPr>
-            <w:tcW w:type="dxa" w:w="827"/>
-            <w:tcMar>
-              <w:top w:w="50" w:type="dxa"/>
-              <w:bottom w:w="50" w:type="dxa"/>
-              <w:left w:w="90" w:type="dxa"/>
-              <w:right w:w="90" w:type="dxa"/>
-            </w:tcMar>
-          </w:tcPr>
-          <w:p>
-            <w:pPr>
-              <w:pStyle w:val="BDOITable"/>
-            </w:pPr>
-            <w:r>
-              <w:rPr>
-                <w:sz w:val="16"/>
-              </w:rPr>
-              <w:t>0</w:t>
             </w:r>
           </w:p>
         </w:tc>
@@ -10415,7 +9787,7 @@
         </w:trPr>
         <w:tc>
           <w:tcPr>
-            <w:tcW w:type="dxa" w:w="1188"/>
+            <w:tcW w:type="dxa" w:w="1182"/>
             <w:tcMar>
               <w:top w:w="50" w:type="dxa"/>
               <w:bottom w:w="50" w:type="dxa"/>
@@ -10438,7 +9810,7 @@
         </w:tc>
         <w:tc>
           <w:tcPr>
-            <w:tcW w:type="dxa" w:w="3307"/>
+            <w:tcW w:type="dxa" w:w="3804"/>
             <w:tcMar>
               <w:top w:w="50" w:type="dxa"/>
               <w:bottom w:w="50" w:type="dxa"/>
@@ -10461,7 +9833,7 @@
         </w:tc>
         <w:tc>
           <w:tcPr>
-            <w:tcW w:type="dxa" w:w="1653"/>
+            <w:tcW w:type="dxa" w:w="1953"/>
             <w:tcMar>
               <w:top w:w="50" w:type="dxa"/>
               <w:bottom w:w="50" w:type="dxa"/>
@@ -10484,7 +9856,7 @@
         </w:tc>
         <w:tc>
           <w:tcPr>
-            <w:tcW w:type="dxa" w:w="775"/>
+            <w:tcW w:type="dxa" w:w="771"/>
             <w:tcMar>
               <w:top w:w="50" w:type="dxa"/>
               <w:bottom w:w="50" w:type="dxa"/>
@@ -10507,7 +9879,7 @@
         </w:tc>
         <w:tc>
           <w:tcPr>
-            <w:tcW w:type="dxa" w:w="775"/>
+            <w:tcW w:type="dxa" w:w="771"/>
             <w:tcMar>
               <w:top w:w="50" w:type="dxa"/>
               <w:bottom w:w="50" w:type="dxa"/>
@@ -10530,7 +9902,7 @@
         </w:tc>
         <w:tc>
           <w:tcPr>
-            <w:tcW w:type="dxa" w:w="775"/>
+            <w:tcW w:type="dxa" w:w="771"/>
             <w:tcMar>
               <w:top w:w="50" w:type="dxa"/>
               <w:bottom w:w="50" w:type="dxa"/>
@@ -10553,7 +9925,7 @@
         </w:tc>
         <w:tc>
           <w:tcPr>
-            <w:tcW w:type="dxa" w:w="672"/>
+            <w:tcW w:type="dxa" w:w="720"/>
             <w:tcMar>
               <w:top w:w="50" w:type="dxa"/>
               <w:bottom w:w="50" w:type="dxa"/>
@@ -10571,29 +9943,6 @@
                 <w:sz w:val="16"/>
               </w:rPr>
               <w:t>10</w:t>
-            </w:r>
-          </w:p>
-        </w:tc>
-        <w:tc>
-          <w:tcPr>
-            <w:tcW w:type="dxa" w:w="827"/>
-            <w:tcMar>
-              <w:top w:w="50" w:type="dxa"/>
-              <w:bottom w:w="50" w:type="dxa"/>
-              <w:left w:w="90" w:type="dxa"/>
-              <w:right w:w="90" w:type="dxa"/>
-            </w:tcMar>
-            <w:shd w:val="clear" w:color="auto" w:fill="E5F5FF"/>
-          </w:tcPr>
-          <w:p>
-            <w:pPr>
-              <w:pStyle w:val="BDOITable"/>
-            </w:pPr>
-            <w:r>
-              <w:rPr>
-                <w:sz w:val="16"/>
-              </w:rPr>
-              <w:t>0</w:t>
             </w:r>
           </w:p>
         </w:tc>
@@ -10604,7 +9953,7 @@
         </w:trPr>
         <w:tc>
           <w:tcPr>
-            <w:tcW w:type="dxa" w:w="1188"/>
+            <w:tcW w:type="dxa" w:w="1182"/>
             <w:tcMar>
               <w:top w:w="50" w:type="dxa"/>
               <w:bottom w:w="50" w:type="dxa"/>
@@ -10626,7 +9975,7 @@
         </w:tc>
         <w:tc>
           <w:tcPr>
-            <w:tcW w:type="dxa" w:w="3307"/>
+            <w:tcW w:type="dxa" w:w="3804"/>
             <w:tcMar>
               <w:top w:w="50" w:type="dxa"/>
               <w:bottom w:w="50" w:type="dxa"/>
@@ -10648,7 +9997,7 @@
         </w:tc>
         <w:tc>
           <w:tcPr>
-            <w:tcW w:type="dxa" w:w="1653"/>
+            <w:tcW w:type="dxa" w:w="1953"/>
             <w:tcMar>
               <w:top w:w="50" w:type="dxa"/>
               <w:bottom w:w="50" w:type="dxa"/>
@@ -10670,7 +10019,7 @@
         </w:tc>
         <w:tc>
           <w:tcPr>
-            <w:tcW w:type="dxa" w:w="775"/>
+            <w:tcW w:type="dxa" w:w="771"/>
             <w:tcMar>
               <w:top w:w="50" w:type="dxa"/>
               <w:bottom w:w="50" w:type="dxa"/>
@@ -10692,7 +10041,7 @@
         </w:tc>
         <w:tc>
           <w:tcPr>
-            <w:tcW w:type="dxa" w:w="775"/>
+            <w:tcW w:type="dxa" w:w="771"/>
             <w:tcMar>
               <w:top w:w="50" w:type="dxa"/>
               <w:bottom w:w="50" w:type="dxa"/>
@@ -10714,7 +10063,7 @@
         </w:tc>
         <w:tc>
           <w:tcPr>
-            <w:tcW w:type="dxa" w:w="775"/>
+            <w:tcW w:type="dxa" w:w="771"/>
             <w:tcMar>
               <w:top w:w="50" w:type="dxa"/>
               <w:bottom w:w="50" w:type="dxa"/>
@@ -10736,7 +10085,7 @@
         </w:tc>
         <w:tc>
           <w:tcPr>
-            <w:tcW w:type="dxa" w:w="672"/>
+            <w:tcW w:type="dxa" w:w="720"/>
             <w:tcMar>
               <w:top w:w="50" w:type="dxa"/>
               <w:bottom w:w="50" w:type="dxa"/>
@@ -10753,28 +10102,6 @@
                 <w:sz w:val="16"/>
               </w:rPr>
               <w:t>6</w:t>
-            </w:r>
-          </w:p>
-        </w:tc>
-        <w:tc>
-          <w:tcPr>
-            <w:tcW w:type="dxa" w:w="827"/>
-            <w:tcMar>
-              <w:top w:w="50" w:type="dxa"/>
-              <w:bottom w:w="50" w:type="dxa"/>
-              <w:left w:w="90" w:type="dxa"/>
-              <w:right w:w="90" w:type="dxa"/>
-            </w:tcMar>
-          </w:tcPr>
-          <w:p>
-            <w:pPr>
-              <w:pStyle w:val="BDOITable"/>
-            </w:pPr>
-            <w:r>
-              <w:rPr>
-                <w:sz w:val="16"/>
-              </w:rPr>
-              <w:t>0</w:t>
             </w:r>
           </w:p>
         </w:tc>
@@ -10785,7 +10112,7 @@
         </w:trPr>
         <w:tc>
           <w:tcPr>
-            <w:tcW w:type="dxa" w:w="1188"/>
+            <w:tcW w:type="dxa" w:w="1182"/>
             <w:tcMar>
               <w:top w:w="50" w:type="dxa"/>
               <w:bottom w:w="50" w:type="dxa"/>
@@ -10808,7 +10135,7 @@
         </w:tc>
         <w:tc>
           <w:tcPr>
-            <w:tcW w:type="dxa" w:w="3307"/>
+            <w:tcW w:type="dxa" w:w="3804"/>
             <w:tcMar>
               <w:top w:w="50" w:type="dxa"/>
               <w:bottom w:w="50" w:type="dxa"/>
@@ -10831,7 +10158,7 @@
         </w:tc>
         <w:tc>
           <w:tcPr>
-            <w:tcW w:type="dxa" w:w="1653"/>
+            <w:tcW w:type="dxa" w:w="1953"/>
             <w:tcMar>
               <w:top w:w="50" w:type="dxa"/>
               <w:bottom w:w="50" w:type="dxa"/>
@@ -10854,7 +10181,7 @@
         </w:tc>
         <w:tc>
           <w:tcPr>
-            <w:tcW w:type="dxa" w:w="775"/>
+            <w:tcW w:type="dxa" w:w="771"/>
             <w:tcMar>
               <w:top w:w="50" w:type="dxa"/>
               <w:bottom w:w="50" w:type="dxa"/>
@@ -10877,7 +10204,7 @@
         </w:tc>
         <w:tc>
           <w:tcPr>
-            <w:tcW w:type="dxa" w:w="775"/>
+            <w:tcW w:type="dxa" w:w="771"/>
             <w:tcMar>
               <w:top w:w="50" w:type="dxa"/>
               <w:bottom w:w="50" w:type="dxa"/>
@@ -10900,7 +10227,7 @@
         </w:tc>
         <w:tc>
           <w:tcPr>
-            <w:tcW w:type="dxa" w:w="775"/>
+            <w:tcW w:type="dxa" w:w="771"/>
             <w:tcMar>
               <w:top w:w="50" w:type="dxa"/>
               <w:bottom w:w="50" w:type="dxa"/>
@@ -10923,7 +10250,7 @@
         </w:tc>
         <w:tc>
           <w:tcPr>
-            <w:tcW w:type="dxa" w:w="672"/>
+            <w:tcW w:type="dxa" w:w="720"/>
             <w:tcMar>
               <w:top w:w="50" w:type="dxa"/>
               <w:bottom w:w="50" w:type="dxa"/>
@@ -10941,29 +10268,6 @@
                 <w:sz w:val="16"/>
               </w:rPr>
               <w:t>9</w:t>
-            </w:r>
-          </w:p>
-        </w:tc>
-        <w:tc>
-          <w:tcPr>
-            <w:tcW w:type="dxa" w:w="827"/>
-            <w:tcMar>
-              <w:top w:w="50" w:type="dxa"/>
-              <w:bottom w:w="50" w:type="dxa"/>
-              <w:left w:w="90" w:type="dxa"/>
-              <w:right w:w="90" w:type="dxa"/>
-            </w:tcMar>
-            <w:shd w:val="clear" w:color="auto" w:fill="E5F5FF"/>
-          </w:tcPr>
-          <w:p>
-            <w:pPr>
-              <w:pStyle w:val="BDOITable"/>
-            </w:pPr>
-            <w:r>
-              <w:rPr>
-                <w:sz w:val="16"/>
-              </w:rPr>
-              <w:t>0</w:t>
             </w:r>
           </w:p>
         </w:tc>
@@ -10974,7 +10278,7 @@
         </w:trPr>
         <w:tc>
           <w:tcPr>
-            <w:tcW w:type="dxa" w:w="1188"/>
+            <w:tcW w:type="dxa" w:w="1182"/>
             <w:tcMar>
               <w:top w:w="50" w:type="dxa"/>
               <w:bottom w:w="50" w:type="dxa"/>
@@ -10996,7 +10300,7 @@
         </w:tc>
         <w:tc>
           <w:tcPr>
-            <w:tcW w:type="dxa" w:w="3307"/>
+            <w:tcW w:type="dxa" w:w="3804"/>
             <w:tcMar>
               <w:top w:w="50" w:type="dxa"/>
               <w:bottom w:w="50" w:type="dxa"/>
@@ -11018,7 +10322,7 @@
         </w:tc>
         <w:tc>
           <w:tcPr>
-            <w:tcW w:type="dxa" w:w="1653"/>
+            <w:tcW w:type="dxa" w:w="1953"/>
             <w:tcMar>
               <w:top w:w="50" w:type="dxa"/>
               <w:bottom w:w="50" w:type="dxa"/>
@@ -11040,7 +10344,7 @@
         </w:tc>
         <w:tc>
           <w:tcPr>
-            <w:tcW w:type="dxa" w:w="775"/>
+            <w:tcW w:type="dxa" w:w="771"/>
             <w:tcMar>
               <w:top w:w="50" w:type="dxa"/>
               <w:bottom w:w="50" w:type="dxa"/>
@@ -11062,7 +10366,7 @@
         </w:tc>
         <w:tc>
           <w:tcPr>
-            <w:tcW w:type="dxa" w:w="775"/>
+            <w:tcW w:type="dxa" w:w="771"/>
             <w:tcMar>
               <w:top w:w="50" w:type="dxa"/>
               <w:bottom w:w="50" w:type="dxa"/>
@@ -11084,7 +10388,7 @@
         </w:tc>
         <w:tc>
           <w:tcPr>
-            <w:tcW w:type="dxa" w:w="775"/>
+            <w:tcW w:type="dxa" w:w="771"/>
             <w:tcMar>
               <w:top w:w="50" w:type="dxa"/>
               <w:bottom w:w="50" w:type="dxa"/>
@@ -11106,7 +10410,7 @@
         </w:tc>
         <w:tc>
           <w:tcPr>
-            <w:tcW w:type="dxa" w:w="672"/>
+            <w:tcW w:type="dxa" w:w="720"/>
             <w:tcMar>
               <w:top w:w="50" w:type="dxa"/>
               <w:bottom w:w="50" w:type="dxa"/>
@@ -11123,28 +10427,6 @@
                 <w:sz w:val="16"/>
               </w:rPr>
               <w:t>4</w:t>
-            </w:r>
-          </w:p>
-        </w:tc>
-        <w:tc>
-          <w:tcPr>
-            <w:tcW w:type="dxa" w:w="827"/>
-            <w:tcMar>
-              <w:top w:w="50" w:type="dxa"/>
-              <w:bottom w:w="50" w:type="dxa"/>
-              <w:left w:w="90" w:type="dxa"/>
-              <w:right w:w="90" w:type="dxa"/>
-            </w:tcMar>
-          </w:tcPr>
-          <w:p>
-            <w:pPr>
-              <w:pStyle w:val="BDOITable"/>
-            </w:pPr>
-            <w:r>
-              <w:rPr>
-                <w:sz w:val="16"/>
-              </w:rPr>
-              <w:t>0</w:t>
             </w:r>
           </w:p>
         </w:tc>
@@ -11155,7 +10437,7 @@
         </w:trPr>
         <w:tc>
           <w:tcPr>
-            <w:tcW w:type="dxa" w:w="1188"/>
+            <w:tcW w:type="dxa" w:w="1182"/>
             <w:tcMar>
               <w:top w:w="50" w:type="dxa"/>
               <w:bottom w:w="50" w:type="dxa"/>
@@ -11178,7 +10460,7 @@
         </w:tc>
         <w:tc>
           <w:tcPr>
-            <w:tcW w:type="dxa" w:w="3307"/>
+            <w:tcW w:type="dxa" w:w="3804"/>
             <w:tcMar>
               <w:top w:w="50" w:type="dxa"/>
               <w:bottom w:w="50" w:type="dxa"/>
@@ -11201,7 +10483,7 @@
         </w:tc>
         <w:tc>
           <w:tcPr>
-            <w:tcW w:type="dxa" w:w="1653"/>
+            <w:tcW w:type="dxa" w:w="1953"/>
             <w:tcMar>
               <w:top w:w="50" w:type="dxa"/>
               <w:bottom w:w="50" w:type="dxa"/>
@@ -11224,7 +10506,7 @@
         </w:tc>
         <w:tc>
           <w:tcPr>
-            <w:tcW w:type="dxa" w:w="775"/>
+            <w:tcW w:type="dxa" w:w="771"/>
             <w:tcMar>
               <w:top w:w="50" w:type="dxa"/>
               <w:bottom w:w="50" w:type="dxa"/>
@@ -11247,7 +10529,7 @@
         </w:tc>
         <w:tc>
           <w:tcPr>
-            <w:tcW w:type="dxa" w:w="775"/>
+            <w:tcW w:type="dxa" w:w="771"/>
             <w:tcMar>
               <w:top w:w="50" w:type="dxa"/>
               <w:bottom w:w="50" w:type="dxa"/>
@@ -11270,7 +10552,7 @@
         </w:tc>
         <w:tc>
           <w:tcPr>
-            <w:tcW w:type="dxa" w:w="775"/>
+            <w:tcW w:type="dxa" w:w="771"/>
             <w:tcMar>
               <w:top w:w="50" w:type="dxa"/>
               <w:bottom w:w="50" w:type="dxa"/>
@@ -11293,7 +10575,7 @@
         </w:tc>
         <w:tc>
           <w:tcPr>
-            <w:tcW w:type="dxa" w:w="672"/>
+            <w:tcW w:type="dxa" w:w="720"/>
             <w:tcMar>
               <w:top w:w="50" w:type="dxa"/>
               <w:bottom w:w="50" w:type="dxa"/>
@@ -11311,29 +10593,6 @@
                 <w:sz w:val="16"/>
               </w:rPr>
               <w:t>11</w:t>
-            </w:r>
-          </w:p>
-        </w:tc>
-        <w:tc>
-          <w:tcPr>
-            <w:tcW w:type="dxa" w:w="827"/>
-            <w:tcMar>
-              <w:top w:w="50" w:type="dxa"/>
-              <w:bottom w:w="50" w:type="dxa"/>
-              <w:left w:w="90" w:type="dxa"/>
-              <w:right w:w="90" w:type="dxa"/>
-            </w:tcMar>
-            <w:shd w:val="clear" w:color="auto" w:fill="E5F5FF"/>
-          </w:tcPr>
-          <w:p>
-            <w:pPr>
-              <w:pStyle w:val="BDOITable"/>
-            </w:pPr>
-            <w:r>
-              <w:rPr>
-                <w:sz w:val="16"/>
-              </w:rPr>
-              <w:t>0</w:t>
             </w:r>
           </w:p>
         </w:tc>
@@ -11344,7 +10603,7 @@
         </w:trPr>
         <w:tc>
           <w:tcPr>
-            <w:tcW w:type="dxa" w:w="1188"/>
+            <w:tcW w:type="dxa" w:w="1182"/>
             <w:tcMar>
               <w:top w:w="50" w:type="dxa"/>
               <w:bottom w:w="50" w:type="dxa"/>
@@ -11366,7 +10625,7 @@
         </w:tc>
         <w:tc>
           <w:tcPr>
-            <w:tcW w:type="dxa" w:w="3307"/>
+            <w:tcW w:type="dxa" w:w="3804"/>
             <w:tcMar>
               <w:top w:w="50" w:type="dxa"/>
               <w:bottom w:w="50" w:type="dxa"/>
@@ -11388,7 +10647,7 @@
         </w:tc>
         <w:tc>
           <w:tcPr>
-            <w:tcW w:type="dxa" w:w="1653"/>
+            <w:tcW w:type="dxa" w:w="1953"/>
             <w:tcMar>
               <w:top w:w="50" w:type="dxa"/>
               <w:bottom w:w="50" w:type="dxa"/>
@@ -11410,7 +10669,7 @@
         </w:tc>
         <w:tc>
           <w:tcPr>
-            <w:tcW w:type="dxa" w:w="775"/>
+            <w:tcW w:type="dxa" w:w="771"/>
             <w:tcMar>
               <w:top w:w="50" w:type="dxa"/>
               <w:bottom w:w="50" w:type="dxa"/>
@@ -11432,7 +10691,7 @@
         </w:tc>
         <w:tc>
           <w:tcPr>
-            <w:tcW w:type="dxa" w:w="775"/>
+            <w:tcW w:type="dxa" w:w="771"/>
             <w:tcMar>
               <w:top w:w="50" w:type="dxa"/>
               <w:bottom w:w="50" w:type="dxa"/>
@@ -11454,7 +10713,7 @@
         </w:tc>
         <w:tc>
           <w:tcPr>
-            <w:tcW w:type="dxa" w:w="775"/>
+            <w:tcW w:type="dxa" w:w="771"/>
             <w:tcMar>
               <w:top w:w="50" w:type="dxa"/>
               <w:bottom w:w="50" w:type="dxa"/>
@@ -11476,7 +10735,7 @@
         </w:tc>
         <w:tc>
           <w:tcPr>
-            <w:tcW w:type="dxa" w:w="672"/>
+            <w:tcW w:type="dxa" w:w="720"/>
             <w:tcMar>
               <w:top w:w="50" w:type="dxa"/>
               <w:bottom w:w="50" w:type="dxa"/>
@@ -11493,28 +10752,6 @@
                 <w:sz w:val="16"/>
               </w:rPr>
               <w:t>6</w:t>
-            </w:r>
-          </w:p>
-        </w:tc>
-        <w:tc>
-          <w:tcPr>
-            <w:tcW w:type="dxa" w:w="827"/>
-            <w:tcMar>
-              <w:top w:w="50" w:type="dxa"/>
-              <w:bottom w:w="50" w:type="dxa"/>
-              <w:left w:w="90" w:type="dxa"/>
-              <w:right w:w="90" w:type="dxa"/>
-            </w:tcMar>
-          </w:tcPr>
-          <w:p>
-            <w:pPr>
-              <w:pStyle w:val="BDOITable"/>
-            </w:pPr>
-            <w:r>
-              <w:rPr>
-                <w:sz w:val="16"/>
-              </w:rPr>
-              <w:t>0</w:t>
             </w:r>
           </w:p>
         </w:tc>
@@ -11525,7 +10762,7 @@
         </w:trPr>
         <w:tc>
           <w:tcPr>
-            <w:tcW w:type="dxa" w:w="1188"/>
+            <w:tcW w:type="dxa" w:w="1182"/>
             <w:tcMar>
               <w:top w:w="50" w:type="dxa"/>
               <w:bottom w:w="50" w:type="dxa"/>
@@ -11548,7 +10785,7 @@
         </w:tc>
         <w:tc>
           <w:tcPr>
-            <w:tcW w:type="dxa" w:w="3307"/>
+            <w:tcW w:type="dxa" w:w="3804"/>
             <w:tcMar>
               <w:top w:w="50" w:type="dxa"/>
               <w:bottom w:w="50" w:type="dxa"/>
@@ -11571,7 +10808,7 @@
         </w:tc>
         <w:tc>
           <w:tcPr>
-            <w:tcW w:type="dxa" w:w="1653"/>
+            <w:tcW w:type="dxa" w:w="1953"/>
             <w:tcMar>
               <w:top w:w="50" w:type="dxa"/>
               <w:bottom w:w="50" w:type="dxa"/>
@@ -11594,7 +10831,7 @@
         </w:tc>
         <w:tc>
           <w:tcPr>
-            <w:tcW w:type="dxa" w:w="775"/>
+            <w:tcW w:type="dxa" w:w="771"/>
             <w:tcMar>
               <w:top w:w="50" w:type="dxa"/>
               <w:bottom w:w="50" w:type="dxa"/>
@@ -11617,7 +10854,7 @@
         </w:tc>
         <w:tc>
           <w:tcPr>
-            <w:tcW w:type="dxa" w:w="775"/>
+            <w:tcW w:type="dxa" w:w="771"/>
             <w:tcMar>
               <w:top w:w="50" w:type="dxa"/>
               <w:bottom w:w="50" w:type="dxa"/>
@@ -11640,7 +10877,7 @@
         </w:tc>
         <w:tc>
           <w:tcPr>
-            <w:tcW w:type="dxa" w:w="775"/>
+            <w:tcW w:type="dxa" w:w="771"/>
             <w:tcMar>
               <w:top w:w="50" w:type="dxa"/>
               <w:bottom w:w="50" w:type="dxa"/>
@@ -11663,7 +10900,7 @@
         </w:tc>
         <w:tc>
           <w:tcPr>
-            <w:tcW w:type="dxa" w:w="672"/>
+            <w:tcW w:type="dxa" w:w="720"/>
             <w:tcMar>
               <w:top w:w="50" w:type="dxa"/>
               <w:bottom w:w="50" w:type="dxa"/>
@@ -11681,29 +10918,6 @@
                 <w:sz w:val="16"/>
               </w:rPr>
               <w:t>3</w:t>
-            </w:r>
-          </w:p>
-        </w:tc>
-        <w:tc>
-          <w:tcPr>
-            <w:tcW w:type="dxa" w:w="827"/>
-            <w:tcMar>
-              <w:top w:w="50" w:type="dxa"/>
-              <w:bottom w:w="50" w:type="dxa"/>
-              <w:left w:w="90" w:type="dxa"/>
-              <w:right w:w="90" w:type="dxa"/>
-            </w:tcMar>
-            <w:shd w:val="clear" w:color="auto" w:fill="E5F5FF"/>
-          </w:tcPr>
-          <w:p>
-            <w:pPr>
-              <w:pStyle w:val="BDOITable"/>
-            </w:pPr>
-            <w:r>
-              <w:rPr>
-                <w:sz w:val="16"/>
-              </w:rPr>
-              <w:t>0</w:t>
             </w:r>
           </w:p>
         </w:tc>
@@ -11714,7 +10928,7 @@
         </w:trPr>
         <w:tc>
           <w:tcPr>
-            <w:tcW w:type="dxa" w:w="1188"/>
+            <w:tcW w:type="dxa" w:w="1182"/>
             <w:tcMar>
               <w:top w:w="50" w:type="dxa"/>
               <w:bottom w:w="50" w:type="dxa"/>
@@ -11736,7 +10950,7 @@
         </w:tc>
         <w:tc>
           <w:tcPr>
-            <w:tcW w:type="dxa" w:w="3307"/>
+            <w:tcW w:type="dxa" w:w="3804"/>
             <w:tcMar>
               <w:top w:w="50" w:type="dxa"/>
               <w:bottom w:w="50" w:type="dxa"/>
@@ -11758,7 +10972,7 @@
         </w:tc>
         <w:tc>
           <w:tcPr>
-            <w:tcW w:type="dxa" w:w="1653"/>
+            <w:tcW w:type="dxa" w:w="1953"/>
             <w:tcMar>
               <w:top w:w="50" w:type="dxa"/>
               <w:bottom w:w="50" w:type="dxa"/>
@@ -11780,7 +10994,7 @@
         </w:tc>
         <w:tc>
           <w:tcPr>
-            <w:tcW w:type="dxa" w:w="775"/>
+            <w:tcW w:type="dxa" w:w="771"/>
             <w:tcMar>
               <w:top w:w="50" w:type="dxa"/>
               <w:bottom w:w="50" w:type="dxa"/>
@@ -11802,7 +11016,7 @@
         </w:tc>
         <w:tc>
           <w:tcPr>
-            <w:tcW w:type="dxa" w:w="775"/>
+            <w:tcW w:type="dxa" w:w="771"/>
             <w:tcMar>
               <w:top w:w="50" w:type="dxa"/>
               <w:bottom w:w="50" w:type="dxa"/>
@@ -11824,7 +11038,7 @@
         </w:tc>
         <w:tc>
           <w:tcPr>
-            <w:tcW w:type="dxa" w:w="775"/>
+            <w:tcW w:type="dxa" w:w="771"/>
             <w:tcMar>
               <w:top w:w="50" w:type="dxa"/>
               <w:bottom w:w="50" w:type="dxa"/>
@@ -11846,7 +11060,7 @@
         </w:tc>
         <w:tc>
           <w:tcPr>
-            <w:tcW w:type="dxa" w:w="672"/>
+            <w:tcW w:type="dxa" w:w="720"/>
             <w:tcMar>
               <w:top w:w="50" w:type="dxa"/>
               <w:bottom w:w="50" w:type="dxa"/>
@@ -11863,28 +11077,6 @@
                 <w:sz w:val="16"/>
               </w:rPr>
               <w:t>5</w:t>
-            </w:r>
-          </w:p>
-        </w:tc>
-        <w:tc>
-          <w:tcPr>
-            <w:tcW w:type="dxa" w:w="827"/>
-            <w:tcMar>
-              <w:top w:w="50" w:type="dxa"/>
-              <w:bottom w:w="50" w:type="dxa"/>
-              <w:left w:w="90" w:type="dxa"/>
-              <w:right w:w="90" w:type="dxa"/>
-            </w:tcMar>
-          </w:tcPr>
-          <w:p>
-            <w:pPr>
-              <w:pStyle w:val="BDOITable"/>
-            </w:pPr>
-            <w:r>
-              <w:rPr>
-                <w:sz w:val="16"/>
-              </w:rPr>
-              <w:t>0</w:t>
             </w:r>
           </w:p>
         </w:tc>
@@ -11895,7 +11087,7 @@
         </w:trPr>
         <w:tc>
           <w:tcPr>
-            <w:tcW w:type="dxa" w:w="1188"/>
+            <w:tcW w:type="dxa" w:w="1182"/>
             <w:tcMar>
               <w:top w:w="50" w:type="dxa"/>
               <w:bottom w:w="50" w:type="dxa"/>
@@ -11918,7 +11110,7 @@
         </w:tc>
         <w:tc>
           <w:tcPr>
-            <w:tcW w:type="dxa" w:w="3307"/>
+            <w:tcW w:type="dxa" w:w="3804"/>
             <w:tcMar>
               <w:top w:w="50" w:type="dxa"/>
               <w:bottom w:w="50" w:type="dxa"/>
@@ -11941,7 +11133,7 @@
         </w:tc>
         <w:tc>
           <w:tcPr>
-            <w:tcW w:type="dxa" w:w="1653"/>
+            <w:tcW w:type="dxa" w:w="1953"/>
             <w:tcMar>
               <w:top w:w="50" w:type="dxa"/>
               <w:bottom w:w="50" w:type="dxa"/>
@@ -11964,7 +11156,7 @@
         </w:tc>
         <w:tc>
           <w:tcPr>
-            <w:tcW w:type="dxa" w:w="775"/>
+            <w:tcW w:type="dxa" w:w="771"/>
             <w:tcMar>
               <w:top w:w="50" w:type="dxa"/>
               <w:bottom w:w="50" w:type="dxa"/>
@@ -11987,7 +11179,7 @@
         </w:tc>
         <w:tc>
           <w:tcPr>
-            <w:tcW w:type="dxa" w:w="775"/>
+            <w:tcW w:type="dxa" w:w="771"/>
             <w:tcMar>
               <w:top w:w="50" w:type="dxa"/>
               <w:bottom w:w="50" w:type="dxa"/>
@@ -12010,7 +11202,7 @@
         </w:tc>
         <w:tc>
           <w:tcPr>
-            <w:tcW w:type="dxa" w:w="775"/>
+            <w:tcW w:type="dxa" w:w="771"/>
             <w:tcMar>
               <w:top w:w="50" w:type="dxa"/>
               <w:bottom w:w="50" w:type="dxa"/>
@@ -12033,7 +11225,7 @@
         </w:tc>
         <w:tc>
           <w:tcPr>
-            <w:tcW w:type="dxa" w:w="672"/>
+            <w:tcW w:type="dxa" w:w="720"/>
             <w:tcMar>
               <w:top w:w="50" w:type="dxa"/>
               <w:bottom w:w="50" w:type="dxa"/>
@@ -12051,29 +11243,6 @@
                 <w:sz w:val="16"/>
               </w:rPr>
               <w:t>5</w:t>
-            </w:r>
-          </w:p>
-        </w:tc>
-        <w:tc>
-          <w:tcPr>
-            <w:tcW w:type="dxa" w:w="827"/>
-            <w:tcMar>
-              <w:top w:w="50" w:type="dxa"/>
-              <w:bottom w:w="50" w:type="dxa"/>
-              <w:left w:w="90" w:type="dxa"/>
-              <w:right w:w="90" w:type="dxa"/>
-            </w:tcMar>
-            <w:shd w:val="clear" w:color="auto" w:fill="E5F5FF"/>
-          </w:tcPr>
-          <w:p>
-            <w:pPr>
-              <w:pStyle w:val="BDOITable"/>
-            </w:pPr>
-            <w:r>
-              <w:rPr>
-                <w:sz w:val="16"/>
-              </w:rPr>
-              <w:t>0</w:t>
             </w:r>
           </w:p>
         </w:tc>
@@ -12084,7 +11253,7 @@
         </w:trPr>
         <w:tc>
           <w:tcPr>
-            <w:tcW w:type="dxa" w:w="1188"/>
+            <w:tcW w:type="dxa" w:w="1182"/>
             <w:tcMar>
               <w:top w:w="50" w:type="dxa"/>
               <w:bottom w:w="50" w:type="dxa"/>
@@ -12106,7 +11275,7 @@
         </w:tc>
         <w:tc>
           <w:tcPr>
-            <w:tcW w:type="dxa" w:w="3307"/>
+            <w:tcW w:type="dxa" w:w="3804"/>
             <w:tcMar>
               <w:top w:w="50" w:type="dxa"/>
               <w:bottom w:w="50" w:type="dxa"/>
@@ -12128,7 +11297,7 @@
         </w:tc>
         <w:tc>
           <w:tcPr>
-            <w:tcW w:type="dxa" w:w="1653"/>
+            <w:tcW w:type="dxa" w:w="1953"/>
             <w:tcMar>
               <w:top w:w="50" w:type="dxa"/>
               <w:bottom w:w="50" w:type="dxa"/>
@@ -12150,7 +11319,7 @@
         </w:tc>
         <w:tc>
           <w:tcPr>
-            <w:tcW w:type="dxa" w:w="775"/>
+            <w:tcW w:type="dxa" w:w="771"/>
             <w:tcMar>
               <w:top w:w="50" w:type="dxa"/>
               <w:bottom w:w="50" w:type="dxa"/>
@@ -12172,7 +11341,7 @@
         </w:tc>
         <w:tc>
           <w:tcPr>
-            <w:tcW w:type="dxa" w:w="775"/>
+            <w:tcW w:type="dxa" w:w="771"/>
             <w:tcMar>
               <w:top w:w="50" w:type="dxa"/>
               <w:bottom w:w="50" w:type="dxa"/>
@@ -12194,7 +11363,7 @@
         </w:tc>
         <w:tc>
           <w:tcPr>
-            <w:tcW w:type="dxa" w:w="775"/>
+            <w:tcW w:type="dxa" w:w="771"/>
             <w:tcMar>
               <w:top w:w="50" w:type="dxa"/>
               <w:bottom w:w="50" w:type="dxa"/>
@@ -12216,7 +11385,7 @@
         </w:tc>
         <w:tc>
           <w:tcPr>
-            <w:tcW w:type="dxa" w:w="672"/>
+            <w:tcW w:type="dxa" w:w="720"/>
             <w:tcMar>
               <w:top w:w="50" w:type="dxa"/>
               <w:bottom w:w="50" w:type="dxa"/>
@@ -12233,28 +11402,6 @@
                 <w:sz w:val="16"/>
               </w:rPr>
               <w:t>4</w:t>
-            </w:r>
-          </w:p>
-        </w:tc>
-        <w:tc>
-          <w:tcPr>
-            <w:tcW w:type="dxa" w:w="827"/>
-            <w:tcMar>
-              <w:top w:w="50" w:type="dxa"/>
-              <w:bottom w:w="50" w:type="dxa"/>
-              <w:left w:w="90" w:type="dxa"/>
-              <w:right w:w="90" w:type="dxa"/>
-            </w:tcMar>
-          </w:tcPr>
-          <w:p>
-            <w:pPr>
-              <w:pStyle w:val="BDOITable"/>
-            </w:pPr>
-            <w:r>
-              <w:rPr>
-                <w:sz w:val="16"/>
-              </w:rPr>
-              <w:t>0</w:t>
             </w:r>
           </w:p>
         </w:tc>
@@ -18881,34 +18028,17 @@
     </w:p>
     <w:p>
       <w:pPr>
-        <w:pStyle w:val="Heading2"/>
-      </w:pPr>
-      <w:bookmarkStart w:id="126" w:name="_Toc000126"/>
-      <w:r>
-        <w:rPr/>
-        <w:t>7.6 Automated tests referenced</w:t>
-      </w:r>
-      <w:bookmarkEnd w:id="126"/>
-    </w:p>
-    <w:p>
-      <w:r>
-        <w:rPr/>
-        <w:t>No automated test exists yet for this BRD; every case is run manually.</w:t>
-      </w:r>
-    </w:p>
-    <w:p>
-      <w:pPr>
         <w:pStyle w:val="Heading1"/>
         <w:pBdr>
           <w:bottom w:val="single" w:sz="4" w:space="4" w:color="99C1E7"/>
         </w:pBdr>
       </w:pPr>
-      <w:bookmarkStart w:id="127" w:name="_Toc000127"/>
+      <w:bookmarkStart w:id="126" w:name="_Toc000126"/>
       <w:r>
         <w:rPr/>
         <w:t>8 Risks</w:t>
       </w:r>
-      <w:bookmarkEnd w:id="127"/>
+      <w:bookmarkEnd w:id="126"/>
     </w:p>
     <w:p>
       <w:pPr>
@@ -19054,7 +18184,7 @@
               <w:rPr>
                 <w:sz w:val="18"/>
               </w:rPr>
-              <w:t>The CSF screens, labels or messages differ from the build design when built</w:t>
+              <w:t>Screen names, labels or messages change after BDOI's review of the FRS</w:t>
             </w:r>
           </w:p>
         </w:tc>
@@ -19098,7 +18228,7 @@
               <w:rPr>
                 <w:sz w:val="18"/>
               </w:rPr>
-              <w:t>Compare the screens with this plan before the system test; update the workbook to version 1.1 with the built texts and message codes</w:t>
+              <w:t>Compare the screens with this plan before the system test; re-issue the workbook with the confirmed texts</w:t>
             </w:r>
           </w:p>
         </w:tc>
@@ -19172,7 +18302,7 @@
               <w:rPr>
                 <w:sz w:val="18"/>
               </w:rPr>
-              <w:t>The values are parameters and lists; the affected cases name them and are re-run after the change without a new build</w:t>
+              <w:t>The values are parameters and lists; the affected cases name them and are re-run after the change without a change to the system</w:t>
             </w:r>
           </w:p>
         </w:tc>
@@ -19608,1131 +18738,6 @@
                 <w:sz w:val="18"/>
               </w:rPr>
               <w:t>Agree named testers and dates outside the peak hours 10:00-12:00 and 14:00-16:00 in the UAT plan (deliverable 30)</w:t>
-            </w:r>
-          </w:p>
-        </w:tc>
-      </w:tr>
-    </w:tbl>
-    <w:p>
-      <w:pPr>
-        <w:pStyle w:val="BDOISpacer"/>
-      </w:pPr>
-    </w:p>
-    <w:p>
-      <w:pPr>
-        <w:pStyle w:val="Heading1"/>
-        <w:pBdr>
-          <w:bottom w:val="single" w:sz="4" w:space="4" w:color="99C1E7"/>
-        </w:pBdr>
-      </w:pPr>
-      <w:bookmarkStart w:id="128" w:name="_Toc000128"/>
-      <w:r>
-        <w:rPr/>
-        <w:t>9 FRS findings</w:t>
-      </w:r>
-      <w:bookmarkEnd w:id="128"/>
-    </w:p>
-    <w:p>
-      <w:r>
-        <w:rPr/>
-        <w:t>Writing the cases showed the points below, where the FRS is ambiguous or cannot be tested as written. The cases use the assumption stated in the proposal; the FRS owner decides the correction for FRS v1.1.</w:t>
-      </w:r>
-    </w:p>
-    <w:p>
-      <w:pPr>
-        <w:pStyle w:val="Caption"/>
-        <w:keepNext/>
-        <w:spacing w:after="60"/>
-      </w:pPr>
-      <w:r>
-        <w:rPr>
-          <w:b/>
-          <w:i w:val="0"/>
-        </w:rPr>
-        <w:t xml:space="preserve">Table 17: </w:t>
-      </w:r>
-      <w:r>
-        <w:rPr/>
-        <w:t>FRS findings for the FRS owner</w:t>
-      </w:r>
-    </w:p>
-    <w:tbl>
-      <w:tblPr>
-        <w:tblW w:type="dxa" w:w="9973"/>
-        <w:jc w:val="center"/>
-        <w:tblLook w:firstColumn="1" w:firstRow="1" w:lastColumn="0" w:lastRow="0" w:noHBand="0" w:noVBand="1" w:val="04A0"/>
-        <w:tblBorders>
-          <w:top w:val="single" w:sz="4" w:space="0" w:color="C2C2C1"/>
-          <w:left w:val="single" w:sz="4" w:space="0" w:color="C2C2C1"/>
-          <w:bottom w:val="single" w:sz="4" w:space="0" w:color="C2C2C1"/>
-          <w:right w:val="single" w:sz="4" w:space="0" w:color="C2C2C1"/>
-          <w:insideH w:val="single" w:sz="4" w:space="0" w:color="C2C2C1"/>
-          <w:insideV w:val="single" w:sz="4" w:space="0" w:color="C2C2C1"/>
-        </w:tblBorders>
-        <w:tblLayout w:type="fixed"/>
-      </w:tblPr>
-      <w:tblGrid>
-        <w:gridCol w:w="1055"/>
-        <w:gridCol w:w="1290"/>
-        <w:gridCol w:w="4223"/>
-        <w:gridCol w:w="3402"/>
-      </w:tblGrid>
-      <w:tr>
-        <w:trPr>
-          <w:tblHeader w:val="true"/>
-          <w:cantSplit w:val="true"/>
-        </w:trPr>
-        <w:tc>
-          <w:tcPr>
-            <w:tcW w:type="dxa" w:w="1056"/>
-            <w:shd w:val="clear" w:color="auto" w:fill="004EA8"/>
-            <w:tcMar>
-              <w:top w:w="50" w:type="dxa"/>
-              <w:bottom w:w="50" w:type="dxa"/>
-              <w:left w:w="90" w:type="dxa"/>
-              <w:right w:w="90" w:type="dxa"/>
-            </w:tcMar>
-            <w:vAlign w:val="center"/>
-          </w:tcPr>
-          <w:p>
-            <w:pPr>
-              <w:pStyle w:val="BDOITableHeader"/>
-            </w:pPr>
-            <w:r>
-              <w:rPr>
-                <w:b/>
-                <w:color w:val="FFFFFF"/>
-                <w:sz w:val="17"/>
-              </w:rPr>
-              <w:t>ID</w:t>
-            </w:r>
-          </w:p>
-        </w:tc>
-        <w:tc>
-          <w:tcPr>
-            <w:tcW w:type="dxa" w:w="1290"/>
-            <w:shd w:val="clear" w:color="auto" w:fill="004EA8"/>
-            <w:tcMar>
-              <w:top w:w="50" w:type="dxa"/>
-              <w:bottom w:w="50" w:type="dxa"/>
-              <w:left w:w="90" w:type="dxa"/>
-              <w:right w:w="90" w:type="dxa"/>
-            </w:tcMar>
-            <w:vAlign w:val="center"/>
-          </w:tcPr>
-          <w:p>
-            <w:pPr>
-              <w:pStyle w:val="BDOITableHeader"/>
-            </w:pPr>
-            <w:r>
-              <w:rPr>
-                <w:b/>
-                <w:color w:val="FFFFFF"/>
-                <w:sz w:val="17"/>
-              </w:rPr>
-              <w:t>FR</w:t>
-            </w:r>
-          </w:p>
-        </w:tc>
-        <w:tc>
-          <w:tcPr>
-            <w:tcW w:type="dxa" w:w="4223"/>
-            <w:shd w:val="clear" w:color="auto" w:fill="004EA8"/>
-            <w:tcMar>
-              <w:top w:w="50" w:type="dxa"/>
-              <w:bottom w:w="50" w:type="dxa"/>
-              <w:left w:w="90" w:type="dxa"/>
-              <w:right w:w="90" w:type="dxa"/>
-            </w:tcMar>
-            <w:vAlign w:val="center"/>
-          </w:tcPr>
-          <w:p>
-            <w:pPr>
-              <w:pStyle w:val="BDOITableHeader"/>
-            </w:pPr>
-            <w:r>
-              <w:rPr>
-                <w:b/>
-                <w:color w:val="FFFFFF"/>
-                <w:sz w:val="17"/>
-              </w:rPr>
-              <w:t>Finding</w:t>
-            </w:r>
-          </w:p>
-        </w:tc>
-        <w:tc>
-          <w:tcPr>
-            <w:tcW w:type="dxa" w:w="3402"/>
-            <w:shd w:val="clear" w:color="auto" w:fill="004EA8"/>
-            <w:tcMar>
-              <w:top w:w="50" w:type="dxa"/>
-              <w:bottom w:w="50" w:type="dxa"/>
-              <w:left w:w="90" w:type="dxa"/>
-              <w:right w:w="90" w:type="dxa"/>
-            </w:tcMar>
-            <w:vAlign w:val="center"/>
-          </w:tcPr>
-          <w:p>
-            <w:pPr>
-              <w:pStyle w:val="BDOITableHeader"/>
-            </w:pPr>
-            <w:r>
-              <w:rPr>
-                <w:b/>
-                <w:color w:val="FFFFFF"/>
-                <w:sz w:val="17"/>
-              </w:rPr>
-              <w:t>Proposed resolution</w:t>
-            </w:r>
-          </w:p>
-        </w:tc>
-      </w:tr>
-      <w:tr>
-        <w:trPr>
-          <w:cantSplit w:val="true"/>
-        </w:trPr>
-        <w:tc>
-          <w:tcPr>
-            <w:tcW w:type="dxa" w:w="1056"/>
-            <w:tcMar>
-              <w:top w:w="50" w:type="dxa"/>
-              <w:bottom w:w="50" w:type="dxa"/>
-              <w:left w:w="90" w:type="dxa"/>
-              <w:right w:w="90" w:type="dxa"/>
-            </w:tcMar>
-          </w:tcPr>
-          <w:p>
-            <w:pPr>
-              <w:pStyle w:val="BDOITable"/>
-            </w:pPr>
-            <w:r>
-              <w:rPr>
-                <w:sz w:val="17"/>
-              </w:rPr>
-              <w:t>TF-CSF-01</w:t>
-            </w:r>
-          </w:p>
-        </w:tc>
-        <w:tc>
-          <w:tcPr>
-            <w:tcW w:type="dxa" w:w="1290"/>
-            <w:tcMar>
-              <w:top w:w="50" w:type="dxa"/>
-              <w:bottom w:w="50" w:type="dxa"/>
-              <w:left w:w="90" w:type="dxa"/>
-              <w:right w:w="90" w:type="dxa"/>
-            </w:tcMar>
-          </w:tcPr>
-          <w:p>
-            <w:pPr>
-              <w:pStyle w:val="BDOITable"/>
-            </w:pPr>
-            <w:r>
-              <w:rPr>
-                <w:sz w:val="17"/>
-              </w:rPr>
-              <w:t>FR-CSF-001</w:t>
-            </w:r>
-          </w:p>
-        </w:tc>
-        <w:tc>
-          <w:tcPr>
-            <w:tcW w:type="dxa" w:w="4223"/>
-            <w:tcMar>
-              <w:top w:w="50" w:type="dxa"/>
-              <w:bottom w:w="50" w:type="dxa"/>
-              <w:left w:w="90" w:type="dxa"/>
-              <w:right w:w="90" w:type="dxa"/>
-            </w:tcMar>
-          </w:tcPr>
-          <w:p>
-            <w:pPr>
-              <w:pStyle w:val="BDOITable"/>
-            </w:pPr>
-            <w:r>
-              <w:rPr>
-                <w:sz w:val="17"/>
-              </w:rPr>
-              <w:t>The FRS messages "Invalid user ID or password" and "Your account is locked. Contact the System Administrator" differ from the platform log-in that BRD-9 reuses (fit FIT), which shows "Invalid user name or password" and "Account is locked. Contact your administrator." Acceptance criterion 3 repeats FR-CSF-002.</w:t>
-            </w:r>
-          </w:p>
-        </w:tc>
-        <w:tc>
-          <w:tcPr>
-            <w:tcW w:type="dxa" w:w="3402"/>
-            <w:tcMar>
-              <w:top w:w="50" w:type="dxa"/>
-              <w:bottom w:w="50" w:type="dxa"/>
-              <w:left w:w="90" w:type="dxa"/>
-              <w:right w:w="90" w:type="dxa"/>
-            </w:tcMar>
-          </w:tcPr>
-          <w:p>
-            <w:pPr>
-              <w:pStyle w:val="BDOITable"/>
-            </w:pPr>
-            <w:r>
-              <w:rPr>
-                <w:sz w:val="17"/>
-              </w:rPr>
-              <w:t>Quote the platform texts in FRS v1.1, as FRS BRD-11 FR-UA-001 does; the cases use the platform texts. Keep criterion 3 in FR-CSF-002 only.</w:t>
-            </w:r>
-          </w:p>
-        </w:tc>
-      </w:tr>
-      <w:tr>
-        <w:trPr>
-          <w:cantSplit w:val="true"/>
-        </w:trPr>
-        <w:tc>
-          <w:tcPr>
-            <w:tcW w:type="dxa" w:w="1056"/>
-            <w:tcMar>
-              <w:top w:w="50" w:type="dxa"/>
-              <w:bottom w:w="50" w:type="dxa"/>
-              <w:left w:w="90" w:type="dxa"/>
-              <w:right w:w="90" w:type="dxa"/>
-            </w:tcMar>
-            <w:shd w:val="clear" w:color="auto" w:fill="E5F5FF"/>
-          </w:tcPr>
-          <w:p>
-            <w:pPr>
-              <w:pStyle w:val="BDOITable"/>
-            </w:pPr>
-            <w:r>
-              <w:rPr>
-                <w:sz w:val="17"/>
-              </w:rPr>
-              <w:t>TF-CSF-02</w:t>
-            </w:r>
-          </w:p>
-        </w:tc>
-        <w:tc>
-          <w:tcPr>
-            <w:tcW w:type="dxa" w:w="1290"/>
-            <w:tcMar>
-              <w:top w:w="50" w:type="dxa"/>
-              <w:bottom w:w="50" w:type="dxa"/>
-              <w:left w:w="90" w:type="dxa"/>
-              <w:right w:w="90" w:type="dxa"/>
-            </w:tcMar>
-            <w:shd w:val="clear" w:color="auto" w:fill="E5F5FF"/>
-          </w:tcPr>
-          <w:p>
-            <w:pPr>
-              <w:pStyle w:val="BDOITable"/>
-            </w:pPr>
-            <w:r>
-              <w:rPr>
-                <w:sz w:val="17"/>
-              </w:rPr>
-              <w:t>FR-CSF-010</w:t>
-            </w:r>
-          </w:p>
-        </w:tc>
-        <w:tc>
-          <w:tcPr>
-            <w:tcW w:type="dxa" w:w="4223"/>
-            <w:tcMar>
-              <w:top w:w="50" w:type="dxa"/>
-              <w:bottom w:w="50" w:type="dxa"/>
-              <w:left w:w="90" w:type="dxa"/>
-              <w:right w:w="90" w:type="dxa"/>
-            </w:tcMar>
-            <w:shd w:val="clear" w:color="auto" w:fill="E5F5FF"/>
-          </w:tcPr>
-          <w:p>
-            <w:pPr>
-              <w:pStyle w:val="BDOITable"/>
-            </w:pPr>
-            <w:r>
-              <w:rPr>
-                <w:sz w:val="17"/>
-              </w:rPr>
-              <w:t>The response target "within 3 seconds (p.13)" gives no load: number of clients and accounts, concurrent agents. The FRS does not say whether a name search matches the start of the name, any word, or ignores accents and case.</w:t>
-            </w:r>
-          </w:p>
-        </w:tc>
-        <w:tc>
-          <w:tcPr>
-            <w:tcW w:type="dxa" w:w="3402"/>
-            <w:tcMar>
-              <w:top w:w="50" w:type="dxa"/>
-              <w:bottom w:w="50" w:type="dxa"/>
-              <w:left w:w="90" w:type="dxa"/>
-              <w:right w:w="90" w:type="dxa"/>
-            </w:tcMar>
-            <w:shd w:val="clear" w:color="auto" w:fill="E5F5FF"/>
-          </w:tcPr>
-          <w:p>
-            <w:pPr>
-              <w:pStyle w:val="BDOITable"/>
-            </w:pPr>
-            <w:r>
-              <w:rPr>
-                <w:sz w:val="17"/>
-              </w:rPr>
-              <w:t>State the measurement load (24 concurrent users, the year-5 volume of section 8) and the name-matching rule; the cases time searches in the peak window on SIT data.</w:t>
-            </w:r>
-          </w:p>
-        </w:tc>
-      </w:tr>
-      <w:tr>
-        <w:trPr>
-          <w:cantSplit w:val="true"/>
-        </w:trPr>
-        <w:tc>
-          <w:tcPr>
-            <w:tcW w:type="dxa" w:w="1056"/>
-            <w:tcMar>
-              <w:top w:w="50" w:type="dxa"/>
-              <w:bottom w:w="50" w:type="dxa"/>
-              <w:left w:w="90" w:type="dxa"/>
-              <w:right w:w="90" w:type="dxa"/>
-            </w:tcMar>
-          </w:tcPr>
-          <w:p>
-            <w:pPr>
-              <w:pStyle w:val="BDOITable"/>
-            </w:pPr>
-            <w:r>
-              <w:rPr>
-                <w:sz w:val="17"/>
-              </w:rPr>
-              <w:t>TF-CSF-03</w:t>
-            </w:r>
-          </w:p>
-        </w:tc>
-        <w:tc>
-          <w:tcPr>
-            <w:tcW w:type="dxa" w:w="1290"/>
-            <w:tcMar>
-              <w:top w:w="50" w:type="dxa"/>
-              <w:bottom w:w="50" w:type="dxa"/>
-              <w:left w:w="90" w:type="dxa"/>
-              <w:right w:w="90" w:type="dxa"/>
-            </w:tcMar>
-          </w:tcPr>
-          <w:p>
-            <w:pPr>
-              <w:pStyle w:val="BDOITable"/>
-            </w:pPr>
-            <w:r>
-              <w:rPr>
-                <w:sz w:val="17"/>
-              </w:rPr>
-              <w:t>FR-CSF-012</w:t>
-            </w:r>
-          </w:p>
-        </w:tc>
-        <w:tc>
-          <w:tcPr>
-            <w:tcW w:type="dxa" w:w="4223"/>
-            <w:tcMar>
-              <w:top w:w="50" w:type="dxa"/>
-              <w:bottom w:w="50" w:type="dxa"/>
-              <w:left w:w="90" w:type="dxa"/>
-              <w:right w:w="90" w:type="dxa"/>
-            </w:tcMar>
-          </w:tcPr>
-          <w:p>
-            <w:pPr>
-              <w:pStyle w:val="BDOITable"/>
-            </w:pPr>
-            <w:r>
-              <w:rPr>
-                <w:sz w:val="17"/>
-              </w:rPr>
-              <w:t>The mapping list CSF_STATUS_MAP has no rule for an account stage that no row matches, or for two rows that match the same account. A cancelled account with premium outstanding could match Booked and Closed.</w:t>
-            </w:r>
-          </w:p>
-        </w:tc>
-        <w:tc>
-          <w:tcPr>
-            <w:tcW w:type="dxa" w:w="3402"/>
-            <w:tcMar>
-              <w:top w:w="50" w:type="dxa"/>
-              <w:bottom w:w="50" w:type="dxa"/>
-              <w:left w:w="90" w:type="dxa"/>
-              <w:right w:w="90" w:type="dxa"/>
-            </w:tcMar>
-          </w:tcPr>
-          <w:p>
-            <w:pPr>
-              <w:pStyle w:val="BDOITable"/>
-            </w:pPr>
-            <w:r>
-              <w:rPr>
-                <w:sz w:val="17"/>
-              </w:rPr>
-              <w:t>State that the first row by order wins and that an unmatched stage shows a fixed value (for example "Other") with an alert to the list owner.</w:t>
-            </w:r>
-          </w:p>
-        </w:tc>
-      </w:tr>
-      <w:tr>
-        <w:trPr>
-          <w:cantSplit w:val="true"/>
-        </w:trPr>
-        <w:tc>
-          <w:tcPr>
-            <w:tcW w:type="dxa" w:w="1056"/>
-            <w:tcMar>
-              <w:top w:w="50" w:type="dxa"/>
-              <w:bottom w:w="50" w:type="dxa"/>
-              <w:left w:w="90" w:type="dxa"/>
-              <w:right w:w="90" w:type="dxa"/>
-            </w:tcMar>
-            <w:shd w:val="clear" w:color="auto" w:fill="E5F5FF"/>
-          </w:tcPr>
-          <w:p>
-            <w:pPr>
-              <w:pStyle w:val="BDOITable"/>
-            </w:pPr>
-            <w:r>
-              <w:rPr>
-                <w:sz w:val="17"/>
-              </w:rPr>
-              <w:t>TF-CSF-04</w:t>
-            </w:r>
-          </w:p>
-        </w:tc>
-        <w:tc>
-          <w:tcPr>
-            <w:tcW w:type="dxa" w:w="1290"/>
-            <w:tcMar>
-              <w:top w:w="50" w:type="dxa"/>
-              <w:bottom w:w="50" w:type="dxa"/>
-              <w:left w:w="90" w:type="dxa"/>
-              <w:right w:w="90" w:type="dxa"/>
-            </w:tcMar>
-            <w:shd w:val="clear" w:color="auto" w:fill="E5F5FF"/>
-          </w:tcPr>
-          <w:p>
-            <w:pPr>
-              <w:pStyle w:val="BDOITable"/>
-            </w:pPr>
-            <w:r>
-              <w:rPr>
-                <w:sz w:val="17"/>
-              </w:rPr>
-              <w:t>FR-CSF-020</w:t>
-            </w:r>
-          </w:p>
-        </w:tc>
-        <w:tc>
-          <w:tcPr>
-            <w:tcW w:type="dxa" w:w="4223"/>
-            <w:tcMar>
-              <w:top w:w="50" w:type="dxa"/>
-              <w:bottom w:w="50" w:type="dxa"/>
-              <w:left w:w="90" w:type="dxa"/>
-              <w:right w:w="90" w:type="dxa"/>
-            </w:tcMar>
-            <w:shd w:val="clear" w:color="auto" w:fill="E5F5FF"/>
-          </w:tcPr>
-          <w:p>
-            <w:pPr>
-              <w:pStyle w:val="BDOITable"/>
-            </w:pPr>
-            <w:r>
-              <w:rPr>
-                <w:sz w:val="17"/>
-              </w:rPr>
-              <w:t>The checks are Yes / No, so a check the agent did not ask cannot be recorded; "Record the result of the verification checks" does not say whether all four or only one must be answered. Whether a verification is also needed before a resend is open (CSQ03), and it is not stated whether a PASSED verification belongs to the agent or to any agent of the client.</w:t>
-            </w:r>
-          </w:p>
-        </w:tc>
-        <w:tc>
-          <w:tcPr>
-            <w:tcW w:type="dxa" w:w="3402"/>
-            <w:tcMar>
-              <w:top w:w="50" w:type="dxa"/>
-              <w:bottom w:w="50" w:type="dxa"/>
-              <w:left w:w="90" w:type="dxa"/>
-              <w:right w:w="90" w:type="dxa"/>
-            </w:tcMar>
-            <w:shd w:val="clear" w:color="auto" w:fill="E5F5FF"/>
-          </w:tcPr>
-          <w:p>
-            <w:pPr>
-              <w:pStyle w:val="BDOITable"/>
-            </w:pPr>
-            <w:r>
-              <w:rPr>
-                <w:sz w:val="17"/>
-              </w:rPr>
-              <w:t>Add a value "Not asked", state how many checks must be answered, and tie the verification to the agent and client. The cases assume all four are answered and the verification is per agent.</w:t>
-            </w:r>
-          </w:p>
-        </w:tc>
-      </w:tr>
-      <w:tr>
-        <w:trPr>
-          <w:cantSplit w:val="true"/>
-        </w:trPr>
-        <w:tc>
-          <w:tcPr>
-            <w:tcW w:type="dxa" w:w="1056"/>
-            <w:tcMar>
-              <w:top w:w="50" w:type="dxa"/>
-              <w:bottom w:w="50" w:type="dxa"/>
-              <w:left w:w="90" w:type="dxa"/>
-              <w:right w:w="90" w:type="dxa"/>
-            </w:tcMar>
-          </w:tcPr>
-          <w:p>
-            <w:pPr>
-              <w:pStyle w:val="BDOITable"/>
-            </w:pPr>
-            <w:r>
-              <w:rPr>
-                <w:sz w:val="17"/>
-              </w:rPr>
-              <w:t>TF-CSF-05</w:t>
-            </w:r>
-          </w:p>
-        </w:tc>
-        <w:tc>
-          <w:tcPr>
-            <w:tcW w:type="dxa" w:w="1290"/>
-            <w:tcMar>
-              <w:top w:w="50" w:type="dxa"/>
-              <w:bottom w:w="50" w:type="dxa"/>
-              <w:left w:w="90" w:type="dxa"/>
-              <w:right w:w="90" w:type="dxa"/>
-            </w:tcMar>
-          </w:tcPr>
-          <w:p>
-            <w:pPr>
-              <w:pStyle w:val="BDOITable"/>
-            </w:pPr>
-            <w:r>
-              <w:rPr>
-                <w:sz w:val="17"/>
-              </w:rPr>
-              <w:t>FR-CSF-021</w:t>
-            </w:r>
-          </w:p>
-        </w:tc>
-        <w:tc>
-          <w:tcPr>
-            <w:tcW w:type="dxa" w:w="4223"/>
-            <w:tcMar>
-              <w:top w:w="50" w:type="dxa"/>
-              <w:bottom w:w="50" w:type="dxa"/>
-              <w:left w:w="90" w:type="dxa"/>
-              <w:right w:w="90" w:type="dxa"/>
-            </w:tcMar>
-          </w:tcPr>
-          <w:p>
-            <w:pPr>
-              <w:pStyle w:val="BDOITable"/>
-            </w:pPr>
-            <w:r>
-              <w:rPr>
-                <w:sz w:val="17"/>
-              </w:rPr>
-              <w:t>"Add" contact details depends on CSQ15 and cannot be tested; "Philippine mobile format" is not defined (09xxxxxxxxx, +639xxxxxxxxx or both); the phone rule "digits and separators" has no length.</w:t>
-            </w:r>
-          </w:p>
-        </w:tc>
-        <w:tc>
-          <w:tcPr>
-            <w:tcW w:type="dxa" w:w="3402"/>
-            <w:tcMar>
-              <w:top w:w="50" w:type="dxa"/>
-              <w:bottom w:w="50" w:type="dxa"/>
-              <w:left w:w="90" w:type="dxa"/>
-              <w:right w:w="90" w:type="dxa"/>
-            </w:tcMar>
-          </w:tcPr>
-          <w:p>
-            <w:pPr>
-              <w:pStyle w:val="BDOITable"/>
-            </w:pPr>
-            <w:r>
-              <w:rPr>
-                <w:sz w:val="17"/>
-              </w:rPr>
-              <w:t>Define the accepted mobile and phone formats with examples and remove "add" until CSQ15 is answered; the cases use 12345 as an invalid mobile only.</w:t>
-            </w:r>
-          </w:p>
-        </w:tc>
-      </w:tr>
-      <w:tr>
-        <w:trPr>
-          <w:cantSplit w:val="true"/>
-        </w:trPr>
-        <w:tc>
-          <w:tcPr>
-            <w:tcW w:type="dxa" w:w="1056"/>
-            <w:tcMar>
-              <w:top w:w="50" w:type="dxa"/>
-              <w:bottom w:w="50" w:type="dxa"/>
-              <w:left w:w="90" w:type="dxa"/>
-              <w:right w:w="90" w:type="dxa"/>
-            </w:tcMar>
-            <w:shd w:val="clear" w:color="auto" w:fill="E5F5FF"/>
-          </w:tcPr>
-          <w:p>
-            <w:pPr>
-              <w:pStyle w:val="BDOITable"/>
-            </w:pPr>
-            <w:r>
-              <w:rPr>
-                <w:sz w:val="17"/>
-              </w:rPr>
-              <w:t>TF-CSF-06</w:t>
-            </w:r>
-          </w:p>
-        </w:tc>
-        <w:tc>
-          <w:tcPr>
-            <w:tcW w:type="dxa" w:w="1290"/>
-            <w:tcMar>
-              <w:top w:w="50" w:type="dxa"/>
-              <w:bottom w:w="50" w:type="dxa"/>
-              <w:left w:w="90" w:type="dxa"/>
-              <w:right w:w="90" w:type="dxa"/>
-            </w:tcMar>
-            <w:shd w:val="clear" w:color="auto" w:fill="E5F5FF"/>
-          </w:tcPr>
-          <w:p>
-            <w:pPr>
-              <w:pStyle w:val="BDOITable"/>
-            </w:pPr>
-            <w:r>
-              <w:rPr>
-                <w:sz w:val="17"/>
-              </w:rPr>
-              <w:t>FR-CSF-022</w:t>
-            </w:r>
-          </w:p>
-        </w:tc>
-        <w:tc>
-          <w:tcPr>
-            <w:tcW w:type="dxa" w:w="4223"/>
-            <w:tcMar>
-              <w:top w:w="50" w:type="dxa"/>
-              <w:bottom w:w="50" w:type="dxa"/>
-              <w:left w:w="90" w:type="dxa"/>
-              <w:right w:w="90" w:type="dxa"/>
-            </w:tcMar>
-            <w:shd w:val="clear" w:color="auto" w:fill="E5F5FF"/>
-          </w:tcPr>
-          <w:p>
-            <w:pPr>
-              <w:pStyle w:val="BDOITable"/>
-            </w:pPr>
-            <w:r>
-              <w:rPr>
-                <w:sz w:val="17"/>
-              </w:rPr>
-              <w:t>Acceptance covers only the disabled sync. The sending, the number and interval of retries and the FAILED state cannot be tested until the interface is specified (CSQ01).</w:t>
-            </w:r>
-          </w:p>
-        </w:tc>
-        <w:tc>
-          <w:tcPr>
-            <w:tcW w:type="dxa" w:w="3402"/>
-            <w:tcMar>
-              <w:top w:w="50" w:type="dxa"/>
-              <w:bottom w:w="50" w:type="dxa"/>
-              <w:left w:w="90" w:type="dxa"/>
-              <w:right w:w="90" w:type="dxa"/>
-            </w:tcMar>
-            <w:shd w:val="clear" w:color="auto" w:fill="E5F5FF"/>
-          </w:tcPr>
-          <w:p>
-            <w:pPr>
-              <w:pStyle w:val="BDOITable"/>
-            </w:pPr>
-            <w:r>
-              <w:rPr>
-                <w:sz w:val="17"/>
-              </w:rPr>
-              <w:t>Give the retry count and interval as parameters; TC-CSF-022.3-01 and 3-02 stay Blocked until a test stub of the interface exists.</w:t>
-            </w:r>
-          </w:p>
-        </w:tc>
-      </w:tr>
-      <w:tr>
-        <w:trPr>
-          <w:cantSplit w:val="true"/>
-        </w:trPr>
-        <w:tc>
-          <w:tcPr>
-            <w:tcW w:type="dxa" w:w="1056"/>
-            <w:tcMar>
-              <w:top w:w="50" w:type="dxa"/>
-              <w:bottom w:w="50" w:type="dxa"/>
-              <w:left w:w="90" w:type="dxa"/>
-              <w:right w:w="90" w:type="dxa"/>
-            </w:tcMar>
-          </w:tcPr>
-          <w:p>
-            <w:pPr>
-              <w:pStyle w:val="BDOITable"/>
-            </w:pPr>
-            <w:r>
-              <w:rPr>
-                <w:sz w:val="17"/>
-              </w:rPr>
-              <w:t>TF-CSF-07</w:t>
-            </w:r>
-          </w:p>
-        </w:tc>
-        <w:tc>
-          <w:tcPr>
-            <w:tcW w:type="dxa" w:w="1290"/>
-            <w:tcMar>
-              <w:top w:w="50" w:type="dxa"/>
-              <w:bottom w:w="50" w:type="dxa"/>
-              <w:left w:w="90" w:type="dxa"/>
-              <w:right w:w="90" w:type="dxa"/>
-            </w:tcMar>
-          </w:tcPr>
-          <w:p>
-            <w:pPr>
-              <w:pStyle w:val="BDOITable"/>
-            </w:pPr>
-            <w:r>
-              <w:rPr>
-                <w:sz w:val="17"/>
-              </w:rPr>
-              <w:t>FR-CSF-030</w:t>
-            </w:r>
-          </w:p>
-        </w:tc>
-        <w:tc>
-          <w:tcPr>
-            <w:tcW w:type="dxa" w:w="4223"/>
-            <w:tcMar>
-              <w:top w:w="50" w:type="dxa"/>
-              <w:bottom w:w="50" w:type="dxa"/>
-              <w:left w:w="90" w:type="dxa"/>
-              <w:right w:w="90" w:type="dxa"/>
-            </w:tcMar>
-          </w:tcPr>
-          <w:p>
-            <w:pPr>
-              <w:pStyle w:val="BDOITable"/>
-            </w:pPr>
-            <w:r>
-              <w:rPr>
-                <w:sz w:val="17"/>
-              </w:rPr>
-              <w:t>The RA password convention (CSQ06) is open, so the cases can check only that the file needs a password and that the password arrives separately, not its value.</w:t>
-            </w:r>
-          </w:p>
-        </w:tc>
-        <w:tc>
-          <w:tcPr>
-            <w:tcW w:type="dxa" w:w="3402"/>
-            <w:tcMar>
-              <w:top w:w="50" w:type="dxa"/>
-              <w:bottom w:w="50" w:type="dxa"/>
-              <w:left w:w="90" w:type="dxa"/>
-              <w:right w:w="90" w:type="dxa"/>
-            </w:tcMar>
-          </w:tcPr>
-          <w:p>
-            <w:pPr>
-              <w:pStyle w:val="BDOITable"/>
-            </w:pPr>
-            <w:r>
-              <w:rPr>
-                <w:sz w:val="17"/>
-              </w:rPr>
-              <w:t>Add the password rule to FR-CSF-030 when CSQ06 is answered; the cases are then extended with the expected password.</w:t>
-            </w:r>
-          </w:p>
-        </w:tc>
-      </w:tr>
-      <w:tr>
-        <w:trPr>
-          <w:cantSplit w:val="true"/>
-        </w:trPr>
-        <w:tc>
-          <w:tcPr>
-            <w:tcW w:type="dxa" w:w="1056"/>
-            <w:tcMar>
-              <w:top w:w="50" w:type="dxa"/>
-              <w:bottom w:w="50" w:type="dxa"/>
-              <w:left w:w="90" w:type="dxa"/>
-              <w:right w:w="90" w:type="dxa"/>
-            </w:tcMar>
-            <w:shd w:val="clear" w:color="auto" w:fill="E5F5FF"/>
-          </w:tcPr>
-          <w:p>
-            <w:pPr>
-              <w:pStyle w:val="BDOITable"/>
-            </w:pPr>
-            <w:r>
-              <w:rPr>
-                <w:sz w:val="17"/>
-              </w:rPr>
-              <w:t>TF-CSF-08</w:t>
-            </w:r>
-          </w:p>
-        </w:tc>
-        <w:tc>
-          <w:tcPr>
-            <w:tcW w:type="dxa" w:w="1290"/>
-            <w:tcMar>
-              <w:top w:w="50" w:type="dxa"/>
-              <w:bottom w:w="50" w:type="dxa"/>
-              <w:left w:w="90" w:type="dxa"/>
-              <w:right w:w="90" w:type="dxa"/>
-            </w:tcMar>
-            <w:shd w:val="clear" w:color="auto" w:fill="E5F5FF"/>
-          </w:tcPr>
-          <w:p>
-            <w:pPr>
-              <w:pStyle w:val="BDOITable"/>
-            </w:pPr>
-            <w:r>
-              <w:rPr>
-                <w:sz w:val="17"/>
-              </w:rPr>
-              <w:t>FR-CSF-032</w:t>
-            </w:r>
-          </w:p>
-        </w:tc>
-        <w:tc>
-          <w:tcPr>
-            <w:tcW w:type="dxa" w:w="4223"/>
-            <w:tcMar>
-              <w:top w:w="50" w:type="dxa"/>
-              <w:bottom w:w="50" w:type="dxa"/>
-              <w:left w:w="90" w:type="dxa"/>
-              <w:right w:w="90" w:type="dxa"/>
-            </w:tcMar>
-            <w:shd w:val="clear" w:color="auto" w:fill="E5F5FF"/>
-          </w:tcPr>
-          <w:p>
-            <w:pPr>
-              <w:pStyle w:val="BDOITable"/>
-            </w:pPr>
-            <w:r>
-              <w:rPr>
-                <w:sz w:val="17"/>
-              </w:rPr>
-              <w:t>The maximum file size (CSQ08) is not given, so the "too large" boundary cannot be set; the 5-second upload target has no file size.</w:t>
-            </w:r>
-          </w:p>
-        </w:tc>
-        <w:tc>
-          <w:tcPr>
-            <w:tcW w:type="dxa" w:w="3402"/>
-            <w:tcMar>
-              <w:top w:w="50" w:type="dxa"/>
-              <w:bottom w:w="50" w:type="dxa"/>
-              <w:left w:w="90" w:type="dxa"/>
-              <w:right w:w="90" w:type="dxa"/>
-            </w:tcMar>
-            <w:shd w:val="clear" w:color="auto" w:fill="E5F5FF"/>
-          </w:tcPr>
-          <w:p>
-            <w:pPr>
-              <w:pStyle w:val="BDOITable"/>
-            </w:pPr>
-            <w:r>
-              <w:rPr>
-                <w:sz w:val="17"/>
-              </w:rPr>
-              <w:t>State the size limit and the file size for the 5-second target; until then the test uses the platform limit and a 2 MB file.</w:t>
-            </w:r>
-          </w:p>
-        </w:tc>
-      </w:tr>
-      <w:tr>
-        <w:trPr>
-          <w:cantSplit w:val="true"/>
-        </w:trPr>
-        <w:tc>
-          <w:tcPr>
-            <w:tcW w:type="dxa" w:w="1056"/>
-            <w:tcMar>
-              <w:top w:w="50" w:type="dxa"/>
-              <w:bottom w:w="50" w:type="dxa"/>
-              <w:left w:w="90" w:type="dxa"/>
-              <w:right w:w="90" w:type="dxa"/>
-            </w:tcMar>
-          </w:tcPr>
-          <w:p>
-            <w:pPr>
-              <w:pStyle w:val="BDOITable"/>
-            </w:pPr>
-            <w:r>
-              <w:rPr>
-                <w:sz w:val="17"/>
-              </w:rPr>
-              <w:t>TF-CSF-09</w:t>
-            </w:r>
-          </w:p>
-        </w:tc>
-        <w:tc>
-          <w:tcPr>
-            <w:tcW w:type="dxa" w:w="1290"/>
-            <w:tcMar>
-              <w:top w:w="50" w:type="dxa"/>
-              <w:bottom w:w="50" w:type="dxa"/>
-              <w:left w:w="90" w:type="dxa"/>
-              <w:right w:w="90" w:type="dxa"/>
-            </w:tcMar>
-          </w:tcPr>
-          <w:p>
-            <w:pPr>
-              <w:pStyle w:val="BDOITable"/>
-            </w:pPr>
-            <w:r>
-              <w:rPr>
-                <w:sz w:val="17"/>
-              </w:rPr>
-              <w:t>FR-CSF-033</w:t>
-            </w:r>
-          </w:p>
-        </w:tc>
-        <w:tc>
-          <w:tcPr>
-            <w:tcW w:type="dxa" w:w="4223"/>
-            <w:tcMar>
-              <w:top w:w="50" w:type="dxa"/>
-              <w:bottom w:w="50" w:type="dxa"/>
-              <w:left w:w="90" w:type="dxa"/>
-              <w:right w:w="90" w:type="dxa"/>
-            </w:tcMar>
-          </w:tcPr>
-          <w:p>
-            <w:pPr>
-              <w:pStyle w:val="BDOITable"/>
-            </w:pPr>
-            <w:r>
-              <w:rPr>
-                <w:sz w:val="17"/>
-              </w:rPr>
-              <w:t>The permissions matrix gives CSF_MANAGEMENT the Servicing View (CSF_VIEW) but not ATTACHMENT_VIEW. The FRS does not say whether management sees the Documents, Renewal Advice and E-policies tabs as a list without download, or not at all.</w:t>
-            </w:r>
-          </w:p>
-        </w:tc>
-        <w:tc>
-          <w:tcPr>
-            <w:tcW w:type="dxa" w:w="3402"/>
-            <w:tcMar>
-              <w:top w:w="50" w:type="dxa"/>
-              <w:bottom w:w="50" w:type="dxa"/>
-              <w:left w:w="90" w:type="dxa"/>
-              <w:right w:w="90" w:type="dxa"/>
-            </w:tcMar>
-          </w:tcPr>
-          <w:p>
-            <w:pPr>
-              <w:pStyle w:val="BDOITable"/>
-            </w:pPr>
-            <w:r>
-              <w:rPr>
-                <w:sz w:val="17"/>
-              </w:rPr>
-              <w:t>State the behaviour for management in section 3.3; the access checks assume the lists are shown and opening a document is refused.</w:t>
-            </w:r>
-          </w:p>
-        </w:tc>
-      </w:tr>
-      <w:tr>
-        <w:trPr>
-          <w:cantSplit w:val="true"/>
-        </w:trPr>
-        <w:tc>
-          <w:tcPr>
-            <w:tcW w:type="dxa" w:w="1056"/>
-            <w:tcMar>
-              <w:top w:w="50" w:type="dxa"/>
-              <w:bottom w:w="50" w:type="dxa"/>
-              <w:left w:w="90" w:type="dxa"/>
-              <w:right w:w="90" w:type="dxa"/>
-            </w:tcMar>
-            <w:shd w:val="clear" w:color="auto" w:fill="E5F5FF"/>
-          </w:tcPr>
-          <w:p>
-            <w:pPr>
-              <w:pStyle w:val="BDOITable"/>
-            </w:pPr>
-            <w:r>
-              <w:rPr>
-                <w:sz w:val="17"/>
-              </w:rPr>
-              <w:t>TF-CSF-10</w:t>
-            </w:r>
-          </w:p>
-        </w:tc>
-        <w:tc>
-          <w:tcPr>
-            <w:tcW w:type="dxa" w:w="1290"/>
-            <w:tcMar>
-              <w:top w:w="50" w:type="dxa"/>
-              <w:bottom w:w="50" w:type="dxa"/>
-              <w:left w:w="90" w:type="dxa"/>
-              <w:right w:w="90" w:type="dxa"/>
-            </w:tcMar>
-            <w:shd w:val="clear" w:color="auto" w:fill="E5F5FF"/>
-          </w:tcPr>
-          <w:p>
-            <w:pPr>
-              <w:pStyle w:val="BDOITable"/>
-            </w:pPr>
-            <w:r>
-              <w:rPr>
-                <w:sz w:val="17"/>
-              </w:rPr>
-              <w:t>FR-CSF-043</w:t>
-            </w:r>
-          </w:p>
-        </w:tc>
-        <w:tc>
-          <w:tcPr>
-            <w:tcW w:type="dxa" w:w="4223"/>
-            <w:tcMar>
-              <w:top w:w="50" w:type="dxa"/>
-              <w:bottom w:w="50" w:type="dxa"/>
-              <w:left w:w="90" w:type="dxa"/>
-              <w:right w:w="90" w:type="dxa"/>
-            </w:tcMar>
-            <w:shd w:val="clear" w:color="auto" w:fill="E5F5FF"/>
-          </w:tcPr>
-          <w:p>
-            <w:pPr>
-              <w:pStyle w:val="BDOITable"/>
-            </w:pPr>
-            <w:r>
-              <w:rPr>
-                <w:sz w:val="17"/>
-              </w:rPr>
-              <w:t>The requirement is an infrastructure control and has no screen; the BRD's 4-hour RPO and backup (retention table) conflict with the 15-minute backup (CSQ11).</w:t>
-            </w:r>
-          </w:p>
-        </w:tc>
-        <w:tc>
-          <w:tcPr>
-            <w:tcW w:type="dxa" w:w="3402"/>
-            <w:tcMar>
-              <w:top w:w="50" w:type="dxa"/>
-              <w:bottom w:w="50" w:type="dxa"/>
-              <w:left w:w="90" w:type="dxa"/>
-              <w:right w:w="90" w:type="dxa"/>
-            </w:tcMar>
-            <w:shd w:val="clear" w:color="auto" w:fill="E5F5FF"/>
-          </w:tcPr>
-          <w:p>
-            <w:pPr>
-              <w:pStyle w:val="BDOITable"/>
-            </w:pPr>
-            <w:r>
-              <w:rPr>
-                <w:sz w:val="17"/>
-              </w:rPr>
-              <w:t>Keep FR-CSF-043 for the infrastructure team's evidence (restore test log) and record the CSQ11 answer; the cases are run by the infrastructure team and witnessed by QA.</w:t>
             </w:r>
           </w:p>
         </w:tc>
@@ -20758,12 +18763,12 @@
           <w:bottom w:val="single" w:sz="4" w:space="4" w:color="99C1E7"/>
         </w:pBdr>
       </w:pPr>
-      <w:bookmarkStart w:id="129" w:name="_Toc000129"/>
+      <w:bookmarkStart w:id="127" w:name="_Toc000127"/>
       <w:r>
         <w:rPr/>
-        <w:t>10 Sign-off</w:t>
+        <w:t>9 Sign-off</w:t>
       </w:r>
-      <w:bookmarkEnd w:id="129"/>
+      <w:bookmarkEnd w:id="127"/>
     </w:p>
     <w:p>
       <w:r>

</xml_diff>